<commit_message>
Updated architecture, added related work in docs
</commit_message>
<xml_diff>
--- a/docs/dokumentacija.docx
+++ b/docs/dokumentacija.docx
@@ -108,7 +108,16 @@
           <w:szCs w:val="18"/>
           <w:vertAlign w:val="superscript"/>
         </w:rPr>
-        <w:t>2,</w:t>
+        <w:t>1</w:t>
+      </w:r>
+      <w:r>
+        <w:rPr>
+          <w:b/>
+          <w:bCs/>
+          <w:szCs w:val="18"/>
+          <w:vertAlign w:val="superscript"/>
+        </w:rPr>
+        <w:t>,</w:t>
       </w:r>
       <w:r>
         <w:rPr>
@@ -154,65 +163,7 @@
           <w:szCs w:val="18"/>
           <w:vertAlign w:val="superscript"/>
         </w:rPr>
-        <w:t>3</w:t>
-      </w:r>
-      <w:r>
-        <w:rPr>
-          <w:b/>
-          <w:bCs/>
-          <w:szCs w:val="18"/>
-        </w:rPr>
-        <w:t xml:space="preserve"> (T</w:t>
-      </w:r>
-      <w:r>
-        <w:rPr>
-          <w:b/>
-          <w:bCs/>
-          <w:szCs w:val="18"/>
-        </w:rPr>
-        <w:t>NR</w:t>
-      </w:r>
-      <w:r>
-        <w:rPr>
-          <w:b/>
-          <w:bCs/>
-          <w:szCs w:val="18"/>
-        </w:rPr>
-        <w:t xml:space="preserve"> 1</w:t>
-      </w:r>
-      <w:r>
-        <w:rPr>
-          <w:b/>
-          <w:bCs/>
-          <w:szCs w:val="18"/>
-        </w:rPr>
-        <w:t>2</w:t>
-      </w:r>
-      <w:r>
-        <w:rPr>
-          <w:b/>
-          <w:bCs/>
-          <w:szCs w:val="18"/>
-        </w:rPr>
-        <w:t xml:space="preserve">pt., </w:t>
-      </w:r>
-      <w:proofErr w:type="spellStart"/>
-      <w:r>
-        <w:rPr>
-          <w:b/>
-          <w:bCs/>
-          <w:szCs w:val="18"/>
-        </w:rPr>
-        <w:t>centred</w:t>
-      </w:r>
-      <w:proofErr w:type="spellEnd"/>
-      <w:r>
-        <w:rPr>
-          <w:b/>
-          <w:bCs/>
-          <w:szCs w:val="18"/>
-        </w:rPr>
-        <w:t>)</w:t>
+        <w:t>1</w:t>
       </w:r>
     </w:p>
     <w:p>
@@ -236,11 +187,20 @@
       </w:r>
       <w:r>
         <w:rPr>
+          <w:rFonts w:ascii="Roboto Slab" w:eastAsia="Times New Roman" w:hAnsi="Roboto Slab" w:cs="Roboto Slab"/>
+          <w:color w:val="FFFFFF"/>
+          <w:sz w:val="24"/>
+          <w:lang w:eastAsia="cs-CZ"/>
+        </w:rPr>
+        <w:t xml:space="preserve"> </w:t>
+      </w:r>
+      <w:r>
+        <w:rPr>
           <w:rFonts w:ascii="Times New Roman" w:hAnsi="Times New Roman"/>
           <w:sz w:val="20"/>
           <w:szCs w:val="18"/>
         </w:rPr>
-        <w:t xml:space="preserve">Full </w:t>
+        <w:t>University of Zagreb Faculty of Electrical Engineering and Computing</w:t>
       </w:r>
       <w:r>
         <w:rPr>
@@ -248,171 +208,7 @@
           <w:sz w:val="20"/>
           <w:szCs w:val="18"/>
         </w:rPr>
-        <w:t xml:space="preserve">affiliation </w:t>
-      </w:r>
-      <w:r>
-        <w:rPr>
-          <w:rFonts w:ascii="Times New Roman" w:hAnsi="Times New Roman"/>
-          <w:sz w:val="20"/>
-          <w:szCs w:val="18"/>
-        </w:rPr>
-        <w:t>of first author, including country (in English, T</w:t>
-      </w:r>
-      <w:r>
-        <w:rPr>
-          <w:rFonts w:ascii="Times New Roman" w:hAnsi="Times New Roman"/>
-          <w:sz w:val="20"/>
-          <w:szCs w:val="18"/>
-        </w:rPr>
-        <w:t>NR</w:t>
-      </w:r>
-      <w:r>
-        <w:rPr>
-          <w:rFonts w:ascii="Times New Roman" w:hAnsi="Times New Roman"/>
-          <w:sz w:val="20"/>
-          <w:szCs w:val="18"/>
-        </w:rPr>
-        <w:t xml:space="preserve"> 1</w:t>
-      </w:r>
-      <w:r>
-        <w:rPr>
-          <w:rFonts w:ascii="Times New Roman" w:hAnsi="Times New Roman"/>
-          <w:sz w:val="20"/>
-          <w:szCs w:val="18"/>
-        </w:rPr>
-        <w:t>0</w:t>
-      </w:r>
-      <w:r>
-        <w:rPr>
-          <w:rFonts w:ascii="Times New Roman" w:hAnsi="Times New Roman"/>
-          <w:sz w:val="20"/>
-          <w:szCs w:val="18"/>
-        </w:rPr>
-        <w:t xml:space="preserve">pt. </w:t>
-      </w:r>
-      <w:proofErr w:type="spellStart"/>
-      <w:r>
-        <w:rPr>
-          <w:rFonts w:ascii="Times New Roman" w:hAnsi="Times New Roman"/>
-          <w:sz w:val="20"/>
-          <w:szCs w:val="18"/>
-        </w:rPr>
-        <w:t>centred</w:t>
-      </w:r>
-      <w:proofErr w:type="spellEnd"/>
-      <w:r>
-        <w:rPr>
-          <w:rFonts w:ascii="Times New Roman" w:hAnsi="Times New Roman"/>
-          <w:sz w:val="20"/>
-          <w:szCs w:val="18"/>
-        </w:rPr>
-        <w:t>)</w:t>
-      </w:r>
-    </w:p>
-    <w:p>
-      <w:pPr>
-        <w:pStyle w:val="TTPAddress"/>
-        <w:ind w:firstLine="0"/>
-        <w:rPr>
-          <w:rFonts w:ascii="Times New Roman" w:hAnsi="Times New Roman"/>
-          <w:sz w:val="20"/>
-          <w:szCs w:val="18"/>
-        </w:rPr>
-      </w:pPr>
-      <w:r>
-        <w:rPr>
-          <w:rFonts w:ascii="Times New Roman" w:hAnsi="Times New Roman"/>
-          <w:sz w:val="20"/>
-          <w:szCs w:val="18"/>
-          <w:vertAlign w:val="superscript"/>
-        </w:rPr>
-        <w:t>2</w:t>
-      </w:r>
-      <w:r>
-        <w:rPr>
-          <w:rFonts w:ascii="Times New Roman" w:hAnsi="Times New Roman"/>
-          <w:sz w:val="20"/>
-          <w:szCs w:val="18"/>
-        </w:rPr>
-        <w:t xml:space="preserve">Full </w:t>
-      </w:r>
-      <w:r>
-        <w:rPr>
-          <w:rFonts w:ascii="Times New Roman" w:hAnsi="Times New Roman"/>
-          <w:sz w:val="20"/>
-          <w:szCs w:val="18"/>
-        </w:rPr>
-        <w:t xml:space="preserve">affiliation </w:t>
-      </w:r>
-      <w:r>
-        <w:rPr>
-          <w:rFonts w:ascii="Times New Roman" w:hAnsi="Times New Roman"/>
-          <w:sz w:val="20"/>
-          <w:szCs w:val="18"/>
-        </w:rPr>
-        <w:t>of second author, including country (in English)</w:t>
-      </w:r>
-    </w:p>
-    <w:p>
-      <w:pPr>
-        <w:pStyle w:val="TTPAddress"/>
-        <w:ind w:firstLine="0"/>
-        <w:rPr>
-          <w:rFonts w:ascii="Times New Roman" w:hAnsi="Times New Roman"/>
-          <w:sz w:val="20"/>
-          <w:szCs w:val="18"/>
-        </w:rPr>
-      </w:pPr>
-      <w:r>
-        <w:rPr>
-          <w:rFonts w:ascii="Times New Roman" w:hAnsi="Times New Roman"/>
-          <w:sz w:val="20"/>
-          <w:szCs w:val="18"/>
-          <w:vertAlign w:val="superscript"/>
-        </w:rPr>
-        <w:t>3</w:t>
-      </w:r>
-      <w:r>
-        <w:rPr>
-          <w:rFonts w:ascii="Times New Roman" w:hAnsi="Times New Roman"/>
-          <w:sz w:val="20"/>
-          <w:szCs w:val="18"/>
-        </w:rPr>
-        <w:t xml:space="preserve">List all </w:t>
-      </w:r>
-      <w:r>
-        <w:rPr>
-          <w:rFonts w:ascii="Times New Roman" w:hAnsi="Times New Roman"/>
-          <w:sz w:val="20"/>
-          <w:szCs w:val="18"/>
-        </w:rPr>
-        <w:t xml:space="preserve">affiliation </w:t>
-      </w:r>
-      <w:r>
-        <w:rPr>
-          <w:rFonts w:ascii="Times New Roman" w:hAnsi="Times New Roman"/>
-          <w:sz w:val="20"/>
-          <w:szCs w:val="18"/>
-        </w:rPr>
-        <w:t>in the same way (in English)</w:t>
-      </w:r>
-    </w:p>
-    <w:p>
-      <w:pPr>
-        <w:pStyle w:val="TTPAddress"/>
-        <w:ind w:firstLine="0"/>
-        <w:rPr>
-          <w:rFonts w:ascii="Times New Roman" w:hAnsi="Times New Roman"/>
-          <w:lang w:eastAsia="zh-CN"/>
-        </w:rPr>
-      </w:pPr>
-      <w:r>
-        <w:rPr>
-          <w:rFonts w:ascii="Times New Roman" w:hAnsi="Times New Roman"/>
-          <w:sz w:val="20"/>
-          <w:szCs w:val="18"/>
-        </w:rPr>
-        <w:t>*Corresponding author</w:t>
+        <w:t>, Croatia</w:t>
       </w:r>
     </w:p>
     <w:p>
@@ -471,16 +267,30 @@
           <w:szCs w:val="22"/>
           <w:lang w:eastAsia="sv-SE"/>
         </w:rPr>
-        <w:t>Purpose</w:t>
-      </w:r>
-      <w:r>
-        <w:rPr>
+        <w:t xml:space="preserve">Originality/Value – </w:t>
+      </w:r>
+      <w:r>
+        <w:rPr>
+          <w:bCs/>
           <w:sz w:val="22"/>
           <w:szCs w:val="22"/>
           <w:lang w:eastAsia="sv-SE"/>
         </w:rPr>
-        <w:t xml:space="preserve"> </w:t>
-      </w:r>
+        <w:t>Step based architecture for solving geospatial problems</w:t>
+      </w:r>
+    </w:p>
+    <w:p>
+      <w:pPr>
+        <w:autoSpaceDE/>
+        <w:autoSpaceDN/>
+        <w:spacing w:before="0"/>
+        <w:ind w:firstLine="0"/>
+        <w:rPr>
+          <w:sz w:val="22"/>
+          <w:szCs w:val="22"/>
+          <w:lang w:eastAsia="sv-SE"/>
+        </w:rPr>
+      </w:pPr>
       <w:r>
         <w:rPr>
           <w:b/>
@@ -488,172 +298,23 @@
           <w:szCs w:val="22"/>
           <w:lang w:eastAsia="sv-SE"/>
         </w:rPr>
-        <w:t xml:space="preserve">– </w:t>
-      </w:r>
-      <w:r>
-        <w:rPr>
-          <w:bCs/>
+        <w:t>Keywords</w:t>
+      </w:r>
+      <w:r>
+        <w:rPr>
           <w:sz w:val="22"/>
           <w:szCs w:val="22"/>
           <w:lang w:eastAsia="sv-SE"/>
         </w:rPr>
-        <w:t>Text, text, text, text, text, text, text, text, text, text, text, text, text, text, text, text, text, text, text, text, text, text, text, text, text, text, text, text, text, text, text, text, text, text, text, text, text, text, text, text, text, text, text, text, text, text, text, text, text, text.</w:t>
-      </w:r>
-    </w:p>
-    <w:p>
-      <w:pPr>
-        <w:autoSpaceDE/>
-        <w:autoSpaceDN/>
-        <w:spacing w:before="0"/>
-        <w:ind w:firstLine="0"/>
+        <w:t xml:space="preserve"> </w:t>
+      </w:r>
+      <w:r>
         <w:rPr>
           <w:b/>
           <w:sz w:val="22"/>
           <w:szCs w:val="22"/>
           <w:lang w:eastAsia="sv-SE"/>
         </w:rPr>
-      </w:pPr>
-      <w:r>
-        <w:rPr>
-          <w:b/>
-          <w:sz w:val="22"/>
-          <w:szCs w:val="22"/>
-          <w:lang w:eastAsia="sv-SE"/>
-        </w:rPr>
-        <w:t xml:space="preserve">Design/Methodology/Approach – </w:t>
-      </w:r>
-      <w:r>
-        <w:rPr>
-          <w:bCs/>
-          <w:sz w:val="22"/>
-          <w:szCs w:val="22"/>
-          <w:lang w:eastAsia="sv-SE"/>
-        </w:rPr>
-        <w:t>Text, text, text, text, text, text, text, text, text, text, text, text, text, text, text, text, text, text, text, text, text, text, text, text, text, text, text, text, text, text, text, text, text, text, text, text, text, text, text, text, text, text, text, text, text, text, text, text, text, text.</w:t>
-      </w:r>
-    </w:p>
-    <w:p>
-      <w:pPr>
-        <w:autoSpaceDE/>
-        <w:autoSpaceDN/>
-        <w:spacing w:before="0"/>
-        <w:ind w:firstLine="0"/>
-        <w:rPr>
-          <w:sz w:val="22"/>
-          <w:szCs w:val="22"/>
-          <w:lang w:eastAsia="sv-SE"/>
-        </w:rPr>
-      </w:pPr>
-      <w:r>
-        <w:rPr>
-          <w:b/>
-          <w:sz w:val="22"/>
-          <w:szCs w:val="22"/>
-          <w:lang w:eastAsia="sv-SE"/>
-        </w:rPr>
-        <w:t>Findings</w:t>
-      </w:r>
-      <w:r>
-        <w:rPr>
-          <w:sz w:val="22"/>
-          <w:szCs w:val="22"/>
-          <w:lang w:eastAsia="sv-SE"/>
-        </w:rPr>
-        <w:t xml:space="preserve"> </w:t>
-      </w:r>
-      <w:r>
-        <w:rPr>
-          <w:b/>
-          <w:sz w:val="22"/>
-          <w:szCs w:val="22"/>
-          <w:lang w:eastAsia="sv-SE"/>
-        </w:rPr>
-        <w:t>–</w:t>
-      </w:r>
-      <w:r>
-        <w:rPr>
-          <w:sz w:val="22"/>
-          <w:szCs w:val="22"/>
-          <w:lang w:eastAsia="sv-SE"/>
-        </w:rPr>
-        <w:t xml:space="preserve"> </w:t>
-      </w:r>
-      <w:r>
-        <w:rPr>
-          <w:sz w:val="22"/>
-          <w:szCs w:val="22"/>
-          <w:lang w:eastAsia="sv-SE"/>
-        </w:rPr>
-        <w:t>Text, text, text, text, text, text, text, text, text, text, text, text, text, text, text, text, text, text, text, text, text, text, text, text, text, text, text, text, text, text, text, text, text, text, text, text, text, text, text, text, text, text, text, text, text, text, text, text, text, text.</w:t>
-      </w:r>
-    </w:p>
-    <w:p>
-      <w:pPr>
-        <w:autoSpaceDE/>
-        <w:autoSpaceDN/>
-        <w:spacing w:before="0"/>
-        <w:ind w:firstLine="0"/>
-        <w:rPr>
-          <w:sz w:val="22"/>
-          <w:szCs w:val="22"/>
-          <w:lang w:eastAsia="sv-SE"/>
-        </w:rPr>
-      </w:pPr>
-      <w:r>
-        <w:rPr>
-          <w:b/>
-          <w:sz w:val="22"/>
-          <w:szCs w:val="22"/>
-          <w:lang w:eastAsia="sv-SE"/>
-        </w:rPr>
-        <w:t xml:space="preserve">Originality/Value – </w:t>
-      </w:r>
-      <w:r>
-        <w:rPr>
-          <w:bCs/>
-          <w:sz w:val="22"/>
-          <w:szCs w:val="22"/>
-          <w:lang w:eastAsia="sv-SE"/>
-        </w:rPr>
-        <w:t>Text, text, text, text, text, text, text, text, text, text, text, text, text, text, text, text, text, text, text, text, text, text, text, text, text, text, text, text, text, text, text, text, text, text, text, text, text, text, text, text, text, text, text, text, text, text, text, text, text, text.</w:t>
-      </w:r>
-    </w:p>
-    <w:p>
-      <w:pPr>
-        <w:autoSpaceDE/>
-        <w:autoSpaceDN/>
-        <w:spacing w:before="0"/>
-        <w:ind w:firstLine="0"/>
-        <w:rPr>
-          <w:sz w:val="22"/>
-          <w:szCs w:val="22"/>
-          <w:lang w:eastAsia="sv-SE"/>
-        </w:rPr>
-      </w:pPr>
-      <w:r>
-        <w:rPr>
-          <w:b/>
-          <w:sz w:val="22"/>
-          <w:szCs w:val="22"/>
-          <w:lang w:eastAsia="sv-SE"/>
-        </w:rPr>
-        <w:t>Keywords</w:t>
-      </w:r>
-      <w:r>
-        <w:rPr>
-          <w:sz w:val="22"/>
-          <w:szCs w:val="22"/>
-          <w:lang w:eastAsia="sv-SE"/>
-        </w:rPr>
-        <w:t xml:space="preserve"> </w:t>
-      </w:r>
-      <w:r>
-        <w:rPr>
-          <w:b/>
-          <w:sz w:val="22"/>
-          <w:szCs w:val="22"/>
-          <w:lang w:eastAsia="sv-SE"/>
-        </w:rPr>
         <w:t>–</w:t>
       </w:r>
       <w:r>
@@ -679,7 +340,15 @@
           <w:szCs w:val="22"/>
           <w:lang w:eastAsia="sv-SE"/>
         </w:rPr>
-        <w:t>.</w:t>
+        <w:t xml:space="preserve">; LLM; </w:t>
+      </w:r>
+      <w:r>
+        <w:rPr>
+          <w:sz w:val="22"/>
+          <w:szCs w:val="22"/>
+          <w:lang w:eastAsia="sv-SE"/>
+        </w:rPr>
+        <w:t>Prompt Engineering; Geospatial Analysis; Autonomous GIS; LUCAS dataset;</w:t>
       </w:r>
     </w:p>
     <w:p>
@@ -755,15 +424,7 @@
         <w:jc w:val="both"/>
       </w:pPr>
       <w:r>
-        <w:t xml:space="preserve">In today’s world, where computers play an essential role in our daily lives and AI has reached incredible heights of innovation, we are constantly exploring new ways to apply emerging technologies. However, one area where AI has not yet made a significant impact </w:t>
-      </w:r>
-      <w:proofErr w:type="gramStart"/>
-      <w:r>
-        <w:t>in</w:t>
-      </w:r>
-      <w:proofErr w:type="gramEnd"/>
-      <w:r>
-        <w:t xml:space="preserve"> reaching a wider audience is programming languages.</w:t>
+        <w:t>In today’s world, where computers play an essential role in our daily lives and AI has reached incredible heights of innovation, we are constantly exploring new ways to apply emerging technologies. However, one area where AI has not yet made a significant impact in reaching a wider audience is programming languages.</w:t>
       </w:r>
     </w:p>
     <w:p>
@@ -790,7 +451,6 @@
         <w:jc w:val="both"/>
       </w:pPr>
       <w:r>
-        <w:lastRenderedPageBreak/>
         <w:t>Our project uses the LUCAS dataset to address common challenges in geospatial analysis, such as working with complex spatial data, combining different data sources, and visualizing information. By using open-source LLMs, we aim to create an easy-to-use tool that makes geospatial analysis more accessible to everyone.</w:t>
       </w:r>
     </w:p>
@@ -818,18 +478,333 @@
         <w:rPr>
           <w:szCs w:val="28"/>
         </w:rPr>
+        <w:lastRenderedPageBreak/>
         <w:t>Related work</w:t>
       </w:r>
     </w:p>
     <w:p>
       <w:r>
-        <w:t xml:space="preserve">In this section, an extensive literature overview is provided. The most important findings and methodological issues are described and summarized with references </w:t>
-      </w:r>
-      <w:r>
-        <w:t>to</w:t>
-      </w:r>
-      <w:r>
-        <w:t xml:space="preserve"> the References section of the paper. </w:t>
+        <w:t xml:space="preserve">Early efforts such as GeoGPT </w:t>
+      </w:r>
+      <w:sdt>
+        <w:sdtPr>
+          <w:id w:val="850612030"/>
+          <w:citation/>
+        </w:sdtPr>
+        <w:sdtContent>
+          <w:r>
+            <w:fldChar w:fldCharType="begin"/>
+          </w:r>
+          <w:r>
+            <w:instrText xml:space="preserve">CITATION Zha23 \l 1050 </w:instrText>
+          </w:r>
+          <w:r>
+            <w:fldChar w:fldCharType="separate"/>
+          </w:r>
+          <w:r>
+            <w:t>(Zhang, Wei, Wu, He, &amp; Yu, 2023)</w:t>
+          </w:r>
+          <w:r>
+            <w:fldChar w:fldCharType="end"/>
+          </w:r>
+        </w:sdtContent>
+      </w:sdt>
+      <w:r>
+        <w:t xml:space="preserve">, MapGPT </w:t>
+      </w:r>
+      <w:sdt>
+        <w:sdtPr>
+          <w:id w:val="-1919469887"/>
+          <w:citation/>
+        </w:sdtPr>
+        <w:sdtContent>
+          <w:r>
+            <w:fldChar w:fldCharType="begin"/>
+          </w:r>
+          <w:r>
+            <w:instrText xml:space="preserve">CITATION Fer23 \l 1050 </w:instrText>
+          </w:r>
+          <w:r>
+            <w:fldChar w:fldCharType="separate"/>
+          </w:r>
+          <w:r>
+            <w:t>(Fernandez &amp; Dube, 2023)</w:t>
+          </w:r>
+          <w:r>
+            <w:fldChar w:fldCharType="end"/>
+          </w:r>
+        </w:sdtContent>
+      </w:sdt>
+      <w:r>
+        <w:t xml:space="preserve">, and GeoLLM </w:t>
+      </w:r>
+      <w:sdt>
+        <w:sdtPr>
+          <w:id w:val="-1200538990"/>
+          <w:citation/>
+        </w:sdtPr>
+        <w:sdtContent>
+          <w:r>
+            <w:fldChar w:fldCharType="begin"/>
+          </w:r>
+          <w:r>
+            <w:instrText xml:space="preserve">CITATION Man24 \l 1050 </w:instrText>
+          </w:r>
+          <w:r>
+            <w:fldChar w:fldCharType="separate"/>
+          </w:r>
+          <w:r>
+            <w:t>(Manvi, et al., 2024)</w:t>
+          </w:r>
+          <w:r>
+            <w:fldChar w:fldCharType="end"/>
+          </w:r>
+        </w:sdtContent>
+      </w:sdt>
+      <w:r>
+        <w:t xml:space="preserve"> have explored the potential of AI in spatial data analysis, solution generation, and decision-making. Recent advancements in geospatial AI include applications like flood depth estimation </w:t>
+      </w:r>
+      <w:sdt>
+        <w:sdtPr>
+          <w:id w:val="-527024932"/>
+          <w:citation/>
+        </w:sdtPr>
+        <w:sdtContent>
+          <w:r>
+            <w:fldChar w:fldCharType="begin"/>
+          </w:r>
+          <w:r>
+            <w:instrText xml:space="preserve">CITATION Aki24 \l 1050 </w:instrText>
+          </w:r>
+          <w:r>
+            <w:fldChar w:fldCharType="separate"/>
+          </w:r>
+          <w:r>
+            <w:t>(Akinboyewa, Ning, Lessani, &amp; Li, 2024)</w:t>
+          </w:r>
+          <w:r>
+            <w:fldChar w:fldCharType="end"/>
+          </w:r>
+        </w:sdtContent>
+      </w:sdt>
+      <w:r>
+        <w:t xml:space="preserve">, flood severity mapping </w:t>
+      </w:r>
+      <w:sdt>
+        <w:sdtPr>
+          <w:id w:val="1602676780"/>
+          <w:citation/>
+        </w:sdtPr>
+        <w:sdtContent>
+          <w:r>
+            <w:fldChar w:fldCharType="begin"/>
+          </w:r>
+          <w:r>
+            <w:instrText xml:space="preserve">CITATION Fen20 \l 1050 </w:instrText>
+          </w:r>
+          <w:r>
+            <w:fldChar w:fldCharType="separate"/>
+          </w:r>
+          <w:r>
+            <w:t>(Feng, Brenner, &amp; Sester, 2020)</w:t>
+          </w:r>
+          <w:r>
+            <w:fldChar w:fldCharType="end"/>
+          </w:r>
+        </w:sdtContent>
+      </w:sdt>
+      <w:r>
+        <w:t xml:space="preserve">, disaster data interpretation </w:t>
+      </w:r>
+      <w:sdt>
+        <w:sdtPr>
+          <w:id w:val="-2095082129"/>
+          <w:citation/>
+        </w:sdtPr>
+        <w:sdtContent>
+          <w:r>
+            <w:fldChar w:fldCharType="begin"/>
+          </w:r>
+          <w:r>
+            <w:instrText xml:space="preserve">CITATION HuY23 \l 1050 </w:instrText>
+          </w:r>
+          <w:r>
+            <w:fldChar w:fldCharType="separate"/>
+          </w:r>
+          <w:r>
+            <w:t>(Hu, et al., 2023)</w:t>
+          </w:r>
+          <w:r>
+            <w:fldChar w:fldCharType="end"/>
+          </w:r>
+        </w:sdtContent>
+      </w:sdt>
+      <w:r>
+        <w:t xml:space="preserve">, place identity analysis </w:t>
+      </w:r>
+      <w:sdt>
+        <w:sdtPr>
+          <w:id w:val="-1644880232"/>
+          <w:citation/>
+        </w:sdtPr>
+        <w:sdtContent>
+          <w:r>
+            <w:fldChar w:fldCharType="begin"/>
+          </w:r>
+          <w:r>
+            <w:instrText xml:space="preserve">CITATION Jan23 \l 1050 </w:instrText>
+          </w:r>
+          <w:r>
+            <w:fldChar w:fldCharType="separate"/>
+          </w:r>
+          <w:r>
+            <w:t>(Jang, et al., 2023)</w:t>
+          </w:r>
+          <w:r>
+            <w:fldChar w:fldCharType="end"/>
+          </w:r>
+        </w:sdtContent>
+      </w:sdt>
+      <w:r>
+        <w:t xml:space="preserve">, and ecological studies </w:t>
+      </w:r>
+      <w:sdt>
+        <w:sdtPr>
+          <w:id w:val="-1041440985"/>
+          <w:citation/>
+        </w:sdtPr>
+        <w:sdtContent>
+          <w:r>
+            <w:fldChar w:fldCharType="begin"/>
+          </w:r>
+          <w:r>
+            <w:instrText xml:space="preserve">CITATION Han23 \l 1050 </w:instrText>
+          </w:r>
+          <w:r>
+            <w:fldChar w:fldCharType="separate"/>
+          </w:r>
+          <w:r>
+            <w:t>(Han, et al., 2023)</w:t>
+          </w:r>
+          <w:r>
+            <w:fldChar w:fldCharType="end"/>
+          </w:r>
+        </w:sdtContent>
+      </w:sdt>
+      <w:r>
+        <w:t>. While large foundation models outperform task-specific ones in certain text-based geospatial tasks</w:t>
+      </w:r>
+      <w:r>
+        <w:t xml:space="preserve"> </w:t>
+      </w:r>
+      <w:sdt>
+        <w:sdtPr>
+          <w:id w:val="-781728649"/>
+          <w:citation/>
+        </w:sdtPr>
+        <w:sdtContent>
+          <w:r>
+            <w:fldChar w:fldCharType="begin"/>
+          </w:r>
+          <w:r>
+            <w:instrText xml:space="preserve">CITATION Mai23 \l 1050 </w:instrText>
+          </w:r>
+          <w:r>
+            <w:fldChar w:fldCharType="separate"/>
+          </w:r>
+          <w:r>
+            <w:t>(Mai, et al., 2023)</w:t>
+          </w:r>
+          <w:r>
+            <w:fldChar w:fldCharType="end"/>
+          </w:r>
+        </w:sdtContent>
+      </w:sdt>
+      <w:r>
+        <w:t>, they still struggle with multimodal data that combines diverse formats.</w:t>
+      </w:r>
+    </w:p>
+    <w:p>
+      <w:pPr>
+        <w:ind w:firstLine="0"/>
+      </w:pPr>
+      <w:r>
+        <w:t>Our research focuses on leveraging open-source LLMs for geospatial and soil science, distinguishing it from many studies that rely on proprietary models like ChatGPT. We investigate how AI assistants can effectively communicate with users, emphasizing the role of prompt engineering in generating precise and actionable instructions. Additionally, we explore the structured implementation of such agents to advance autonomous GIS systems, where AI automates spatial data</w:t>
+      </w:r>
+      <w:r>
+        <w:t xml:space="preserve"> </w:t>
+      </w:r>
+      <w:r>
+        <w:t>processing</w:t>
+      </w:r>
+      <w:r>
+        <w:t xml:space="preserve"> </w:t>
+      </w:r>
+      <w:r>
+        <w:t>and visualization.</w:t>
+      </w:r>
+    </w:p>
+    <w:p>
+      <w:pPr>
+        <w:ind w:firstLine="0"/>
+      </w:pPr>
+      <w:r>
+        <w:t xml:space="preserve">A recent study introduced the concept of autonomous GIS, where AI-driven systems independently handle spatial problems </w:t>
+      </w:r>
+      <w:sdt>
+        <w:sdtPr>
+          <w:id w:val="1365181981"/>
+          <w:citation/>
+        </w:sdtPr>
+        <w:sdtContent>
+          <w:r>
+            <w:fldChar w:fldCharType="begin"/>
+          </w:r>
+          <w:r>
+            <w:instrText xml:space="preserve"> CITATION LiZ23 \l 1033 </w:instrText>
+          </w:r>
+          <w:r>
+            <w:fldChar w:fldCharType="separate"/>
+          </w:r>
+          <w:r>
+            <w:t>(Li &amp; Ning, 2023)</w:t>
+          </w:r>
+          <w:r>
+            <w:fldChar w:fldCharType="end"/>
+          </w:r>
+        </w:sdtContent>
+      </w:sdt>
+      <w:r>
+        <w:t>. A prototype, LLM-Geo</w:t>
+      </w:r>
+      <w:r>
+        <w:t xml:space="preserve"> </w:t>
+      </w:r>
+      <w:sdt>
+        <w:sdtPr>
+          <w:id w:val="493922932"/>
+          <w:citation/>
+        </w:sdtPr>
+        <w:sdtContent>
+          <w:r>
+            <w:fldChar w:fldCharType="begin"/>
+          </w:r>
+          <w:r>
+            <w:instrText xml:space="preserve"> CITATION LiZ23 \l 1033 </w:instrText>
+          </w:r>
+          <w:r>
+            <w:fldChar w:fldCharType="separate"/>
+          </w:r>
+          <w:r>
+            <w:t>(Li &amp; Ning, 2023)</w:t>
+          </w:r>
+          <w:r>
+            <w:fldChar w:fldCharType="end"/>
+          </w:r>
+        </w:sdtContent>
+      </w:sdt>
+      <w:r>
+        <w:t>, used GPT-4 to generate numerical summaries, graphs, and maps, significantly reducing manual workload. However, it lacks key features like logging and code validation, which are crucial for real-world deployment. While straightforward queries can be solved directly by models like GPT-4o, complex spatial tasks would benefit from a structured approach where the LLM first formulates a plan before execution. This strategy could lead to more accurate, reliable, and interpretable results.</w:t>
       </w:r>
     </w:p>
     <w:p>
@@ -895,13 +870,7 @@
         <w:t>In this research we used LUCAS (Land Use and Coverage Area frame Survey) Soil dataset from 2018.</w:t>
       </w:r>
       <w:r>
-        <w:t xml:space="preserve"> It is a </w:t>
-      </w:r>
-      <w:r>
-        <w:t>comprehensive version of the LUCAS survey, providing high-quality data on land use, land cover, and soil properties across the European Union</w:t>
-      </w:r>
-      <w:r>
-        <w:t>. The dataset provides detailed information about the land use and land cover, soil properties such as texture, organic carbon, pH levels and others. Additionally, it contains subsoil properties such as organic carbon content and calcium carbonate content at bigger depths (20-30cm) and geospatial and administrative data.</w:t>
+        <w:t xml:space="preserve"> It is a comprehensive version of the LUCAS survey, providing high-quality data on land use, land cover, and soil properties across the European Union. The dataset provides detailed information about the land use and land cover, soil properties such as texture, organic carbon, pH levels and others. Additionally, it contains subsoil properties such as organic carbon content and calcium carbonate content at bigger depths (20-30cm) and geospatial and administrative data.</w:t>
       </w:r>
     </w:p>
     <w:p>
@@ -913,10 +882,17 @@
         </w:numPr>
       </w:pPr>
       <w:r>
+        <w:lastRenderedPageBreak/>
         <w:t>Architecture</w:t>
       </w:r>
     </w:p>
     <w:p>
+      <w:pPr>
+        <w:rPr>
+          <w:b/>
+          <w:bCs/>
+        </w:rPr>
+      </w:pPr>
       <w:r>
         <w:t xml:space="preserve">On </w:t>
       </w:r>
@@ -930,13 +906,7 @@
         <w:fldChar w:fldCharType="separate"/>
       </w:r>
       <w:r>
-        <w:t xml:space="preserve">Figure </w:t>
-      </w:r>
-      <w:r>
-        <w:rPr>
-          <w:noProof/>
-        </w:rPr>
-        <w:t>1</w:t>
+        <w:t>Figure 1</w:t>
       </w:r>
       <w:r>
         <w:fldChar w:fldCharType="end"/>
@@ -957,10 +927,19 @@
         <w:t xml:space="preserve"> we receive the user query, that query is then </w:t>
       </w:r>
       <w:r>
-        <w:t xml:space="preserve">embedded in the system prompt. </w:t>
-      </w:r>
-      <w:r>
-        <w:t xml:space="preserve">With the user query, system prompt also contains the </w:t>
+        <w:t>embedded in the system prompt</w:t>
+      </w:r>
+      <w:r>
+        <w:t xml:space="preserve"> for data transformation</w:t>
+      </w:r>
+      <w:r>
+        <w:t xml:space="preserve">. </w:t>
+      </w:r>
+      <w:r>
+        <w:t>Together w</w:t>
+      </w:r>
+      <w:r>
+        <w:t xml:space="preserve">ith the user query, system prompt also contains the </w:t>
       </w:r>
       <w:r>
         <w:t xml:space="preserve">description of </w:t>
@@ -969,10 +948,19 @@
         <w:t>the columns</w:t>
       </w:r>
       <w:r>
-        <w:t xml:space="preserve"> together with </w:t>
-      </w:r>
-      <w:r>
-        <w:t>the types of the columns</w:t>
+        <w:t xml:space="preserve"> with </w:t>
+      </w:r>
+      <w:r>
+        <w:t>its</w:t>
+      </w:r>
+      <w:r>
+        <w:t xml:space="preserve"> </w:t>
+      </w:r>
+      <w:r>
+        <w:t>types,</w:t>
+      </w:r>
+      <w:r>
+        <w:t xml:space="preserve"> and we also add the list of the available pandas functions we suggest it to use</w:t>
       </w:r>
       <w:r>
         <w:t>.</w:t>
@@ -987,46 +975,19 @@
         <w:t>taken from the official documentation of the dataset.</w:t>
       </w:r>
       <w:r>
+        <w:t xml:space="preserve"> This ensures that the </w:t>
+      </w:r>
+      <w:r>
+        <w:t>Coder</w:t>
+      </w:r>
+      <w:r>
+        <w:t xml:space="preserve"> LLM has a complete understanding of the dataset's structure and semantics, reducing ambiguity and increasing the quality of the generated instructions.</w:t>
+      </w:r>
+      <w:r>
         <w:t xml:space="preserve"> </w:t>
       </w:r>
       <w:r>
-        <w:t xml:space="preserve">This ensures that </w:t>
-      </w:r>
-      <w:proofErr w:type="gramStart"/>
-      <w:r>
-        <w:t>the Instruction</w:t>
-      </w:r>
-      <w:proofErr w:type="gramEnd"/>
-      <w:r>
-        <w:t xml:space="preserve"> LLM has a complete understanding of the dataset's structure and semantics, reducing ambiguity and </w:t>
-      </w:r>
-      <w:r>
-        <w:lastRenderedPageBreak/>
-        <w:t>increasing the quality of the generated instructions.</w:t>
-      </w:r>
-      <w:r>
-        <w:t xml:space="preserve"> </w:t>
-      </w:r>
-      <w:r>
-        <w:t>We request from the</w:t>
-      </w:r>
-      <w:r>
-        <w:t xml:space="preserve"> Instruction</w:t>
-      </w:r>
-      <w:r>
-        <w:t xml:space="preserve"> LLM </w:t>
-      </w:r>
-      <w:r>
-        <w:t xml:space="preserve">the response in the JSON format displayed </w:t>
-      </w:r>
-      <w:r>
-        <w:t>in the text</w:t>
-      </w:r>
-      <w:r>
-        <w:t>box below</w:t>
-      </w:r>
-      <w:r>
-        <w:t>.</w:t>
+        <w:t>Additionally, we instruct the Coder LLM only to return the python code without additional text, tell it where the data about the map of Europe is stored and request it to put the final transformation result in specified variable. The preloaded information about where the map of Europe is stored, along with instructions to place the final transformed dataset into a specific variable, reduces complexity and the risk of error.</w:t>
       </w:r>
     </w:p>
     <w:p>
@@ -1034,828 +995,173 @@
         <w:ind w:firstLine="0"/>
       </w:pPr>
       <w:r>
-        <w:rPr>
-          <w:noProof/>
-        </w:rPr>
-        <mc:AlternateContent>
-          <mc:Choice Requires="wps">
-            <w:drawing>
-              <wp:anchor distT="45720" distB="45720" distL="114300" distR="114300" simplePos="0" relativeHeight="251659264" behindDoc="0" locked="0" layoutInCell="1" allowOverlap="1" wp14:anchorId="2EB75DA9" wp14:editId="1FAB2074">
-                <wp:simplePos x="0" y="0"/>
-                <wp:positionH relativeFrom="column">
-                  <wp:posOffset>166370</wp:posOffset>
-                </wp:positionH>
-                <wp:positionV relativeFrom="paragraph">
-                  <wp:posOffset>2098675</wp:posOffset>
-                </wp:positionV>
-                <wp:extent cx="5448300" cy="1404620"/>
-                <wp:effectExtent l="0" t="0" r="19050" b="16510"/>
-                <wp:wrapTopAndBottom/>
-                <wp:docPr id="217" name="Text Box 2"/>
-                <wp:cNvGraphicFramePr>
-                  <a:graphicFrameLocks xmlns:a="http://schemas.openxmlformats.org/drawingml/2006/main"/>
-                </wp:cNvGraphicFramePr>
-                <a:graphic xmlns:a="http://schemas.openxmlformats.org/drawingml/2006/main">
-                  <a:graphicData uri="http://schemas.microsoft.com/office/word/2010/wordprocessingShape">
-                    <wps:wsp>
-                      <wps:cNvSpPr txBox="1">
-                        <a:spLocks noChangeArrowheads="1"/>
-                      </wps:cNvSpPr>
-                      <wps:spPr bwMode="auto">
-                        <a:xfrm>
-                          <a:off x="0" y="0"/>
-                          <a:ext cx="5448300" cy="1404620"/>
-                        </a:xfrm>
-                        <a:prstGeom prst="rect">
-                          <a:avLst/>
-                        </a:prstGeom>
-                        <a:solidFill>
-                          <a:schemeClr val="bg1">
-                            <a:lumMod val="85000"/>
-                          </a:schemeClr>
-                        </a:solidFill>
-                        <a:ln w="9525">
-                          <a:solidFill>
-                            <a:srgbClr val="000000"/>
-                          </a:solidFill>
-                          <a:miter lim="800000"/>
-                          <a:headEnd/>
-                          <a:tailEnd/>
-                        </a:ln>
-                      </wps:spPr>
-                      <wps:txbx>
-                        <w:txbxContent>
-                          <w:p>
-                            <w:pPr>
-                              <w:ind w:firstLine="0"/>
-                              <w:rPr>
-                                <w:rFonts w:ascii="Consolas" w:hAnsi="Consolas"/>
-                                <w:sz w:val="20"/>
-                                <w:szCs w:val="16"/>
-                              </w:rPr>
-                            </w:pPr>
-                            <w:r>
-                              <w:rPr>
-                                <w:rFonts w:ascii="Consolas" w:hAnsi="Consolas"/>
-                                <w:sz w:val="20"/>
-                                <w:szCs w:val="16"/>
-                              </w:rPr>
-                              <w:t>{</w:t>
-                            </w:r>
-                          </w:p>
-                          <w:p>
-                            <w:pPr>
-                              <w:ind w:left="216" w:firstLine="0"/>
-                              <w:rPr>
-                                <w:rFonts w:ascii="Consolas" w:hAnsi="Consolas"/>
-                                <w:sz w:val="20"/>
-                                <w:szCs w:val="16"/>
-                              </w:rPr>
-                            </w:pPr>
-                            <w:r>
-                              <w:rPr>
-                                <w:rFonts w:ascii="Consolas" w:hAnsi="Consolas"/>
-                                <w:color w:val="C45911" w:themeColor="accent2" w:themeShade="BF"/>
-                                <w:sz w:val="20"/>
-                                <w:szCs w:val="16"/>
-                              </w:rPr>
-                              <w:t>"transform"</w:t>
-                            </w:r>
-                            <w:r>
-                              <w:rPr>
-                                <w:rFonts w:ascii="Consolas" w:hAnsi="Consolas"/>
-                                <w:sz w:val="20"/>
-                                <w:szCs w:val="16"/>
-                              </w:rPr>
-                              <w:t xml:space="preserve">: </w:t>
-                            </w:r>
-                            <w:r>
-                              <w:rPr>
-                                <w:rFonts w:ascii="Consolas" w:hAnsi="Consolas"/>
-                                <w:color w:val="538135" w:themeColor="accent6" w:themeShade="BF"/>
-                                <w:sz w:val="20"/>
-                                <w:szCs w:val="16"/>
-                              </w:rPr>
-                              <w:t>"A single string describing, in detail, the part of the objective that transforms the data. Results are in '</w:t>
-                            </w:r>
-                            <w:proofErr w:type="spellStart"/>
-                            <w:r>
-                              <w:rPr>
-                                <w:rFonts w:ascii="Consolas" w:hAnsi="Consolas"/>
-                                <w:color w:val="538135" w:themeColor="accent6" w:themeShade="BF"/>
-                                <w:sz w:val="20"/>
-                                <w:szCs w:val="16"/>
-                              </w:rPr>
-                              <w:t>transformed_gdf</w:t>
-                            </w:r>
-                            <w:proofErr w:type="spellEnd"/>
-                            <w:r>
-                              <w:rPr>
-                                <w:rFonts w:ascii="Consolas" w:hAnsi="Consolas"/>
-                                <w:color w:val="538135" w:themeColor="accent6" w:themeShade="BF"/>
-                                <w:sz w:val="20"/>
-                                <w:szCs w:val="16"/>
-                              </w:rPr>
-                              <w:t xml:space="preserve">' </w:t>
-                            </w:r>
-                            <w:proofErr w:type="spellStart"/>
-                            <w:r>
-                              <w:rPr>
-                                <w:rFonts w:ascii="Consolas" w:hAnsi="Consolas"/>
-                                <w:color w:val="538135" w:themeColor="accent6" w:themeShade="BF"/>
-                                <w:sz w:val="20"/>
-                                <w:szCs w:val="16"/>
-                              </w:rPr>
-                              <w:t>GeoDataFrame</w:t>
-                            </w:r>
-                            <w:proofErr w:type="spellEnd"/>
-                            <w:r>
-                              <w:rPr>
-                                <w:rFonts w:ascii="Consolas" w:hAnsi="Consolas"/>
-                                <w:color w:val="538135" w:themeColor="accent6" w:themeShade="BF"/>
-                                <w:sz w:val="20"/>
-                                <w:szCs w:val="16"/>
-                              </w:rPr>
-                              <w:t>. Include specific column names and operations. Do NOT include any code."</w:t>
-                            </w:r>
-                            <w:r>
-                              <w:rPr>
-                                <w:rFonts w:ascii="Consolas" w:hAnsi="Consolas"/>
-                                <w:sz w:val="20"/>
-                                <w:szCs w:val="16"/>
-                              </w:rPr>
-                              <w:t>,</w:t>
-                            </w:r>
-                          </w:p>
-                          <w:p>
-                            <w:pPr>
-                              <w:ind w:left="284" w:firstLine="0"/>
-                              <w:rPr>
-                                <w:rFonts w:ascii="Consolas" w:hAnsi="Consolas"/>
-                                <w:sz w:val="20"/>
-                                <w:szCs w:val="16"/>
-                              </w:rPr>
-                            </w:pPr>
-                            <w:r>
-                              <w:rPr>
-                                <w:rFonts w:ascii="Consolas" w:hAnsi="Consolas"/>
-                                <w:color w:val="C45911" w:themeColor="accent2" w:themeShade="BF"/>
-                                <w:sz w:val="20"/>
-                                <w:szCs w:val="16"/>
-                              </w:rPr>
-                              <w:t>"visualize"</w:t>
-                            </w:r>
-                            <w:r>
-                              <w:rPr>
-                                <w:rFonts w:ascii="Consolas" w:hAnsi="Consolas"/>
-                                <w:sz w:val="20"/>
-                                <w:szCs w:val="16"/>
-                              </w:rPr>
-                              <w:t xml:space="preserve">: </w:t>
-                            </w:r>
-                            <w:r>
-                              <w:rPr>
-                                <w:rFonts w:ascii="Consolas" w:hAnsi="Consolas"/>
-                                <w:color w:val="538135" w:themeColor="accent6" w:themeShade="BF"/>
-                                <w:sz w:val="20"/>
-                                <w:szCs w:val="16"/>
-                              </w:rPr>
-                              <w:t>"A single string describing, in detail, the part of the objective that visualizes specified data from '</w:t>
-                            </w:r>
-                            <w:proofErr w:type="spellStart"/>
-                            <w:r>
-                              <w:rPr>
-                                <w:rFonts w:ascii="Consolas" w:hAnsi="Consolas"/>
-                                <w:color w:val="538135" w:themeColor="accent6" w:themeShade="BF"/>
-                                <w:sz w:val="20"/>
-                                <w:szCs w:val="16"/>
-                              </w:rPr>
-                              <w:t>transformed_gdf</w:t>
-                            </w:r>
-                            <w:proofErr w:type="spellEnd"/>
-                            <w:r>
-                              <w:rPr>
-                                <w:rFonts w:ascii="Consolas" w:hAnsi="Consolas"/>
-                                <w:color w:val="538135" w:themeColor="accent6" w:themeShade="BF"/>
-                                <w:sz w:val="20"/>
-                                <w:szCs w:val="16"/>
-                              </w:rPr>
-                              <w:t xml:space="preserve">' </w:t>
-                            </w:r>
-                            <w:proofErr w:type="spellStart"/>
-                            <w:r>
-                              <w:rPr>
-                                <w:rFonts w:ascii="Consolas" w:hAnsi="Consolas"/>
-                                <w:color w:val="538135" w:themeColor="accent6" w:themeShade="BF"/>
-                                <w:sz w:val="20"/>
-                                <w:szCs w:val="16"/>
-                              </w:rPr>
-                              <w:t>GeoDataFrame</w:t>
-                            </w:r>
-                            <w:proofErr w:type="spellEnd"/>
-                            <w:r>
-                              <w:rPr>
-                                <w:rFonts w:ascii="Consolas" w:hAnsi="Consolas"/>
-                                <w:color w:val="538135" w:themeColor="accent6" w:themeShade="BF"/>
-                                <w:sz w:val="20"/>
-                                <w:szCs w:val="16"/>
-                              </w:rPr>
-                              <w:t>. Visualizations may include printing some result, outputting graphs or overlaying some data on map of Europe. Include specific column names and operations. Do NOT include any code."</w:t>
-                            </w:r>
-                          </w:p>
-                          <w:p>
-                            <w:pPr>
-                              <w:ind w:firstLine="0"/>
-                              <w:rPr>
-                                <w:rFonts w:ascii="Consolas" w:hAnsi="Consolas"/>
-                                <w:sz w:val="20"/>
-                                <w:szCs w:val="16"/>
-                              </w:rPr>
-                            </w:pPr>
-                            <w:r>
-                              <w:rPr>
-                                <w:rFonts w:ascii="Consolas" w:hAnsi="Consolas"/>
-                                <w:sz w:val="20"/>
-                                <w:szCs w:val="16"/>
-                              </w:rPr>
-                              <w:t>}</w:t>
-                            </w:r>
-                          </w:p>
-                        </w:txbxContent>
-                      </wps:txbx>
-                      <wps:bodyPr rot="0" vert="horz" wrap="square" lIns="91440" tIns="45720" rIns="91440" bIns="45720" anchor="t" anchorCtr="0">
-                        <a:spAutoFit/>
-                      </wps:bodyPr>
-                    </wps:wsp>
-                  </a:graphicData>
-                </a:graphic>
-                <wp14:sizeRelH relativeFrom="margin">
-                  <wp14:pctWidth>0</wp14:pctWidth>
-                </wp14:sizeRelH>
-                <wp14:sizeRelV relativeFrom="margin">
-                  <wp14:pctHeight>20000</wp14:pctHeight>
-                </wp14:sizeRelV>
-              </wp:anchor>
-            </w:drawing>
-          </mc:Choice>
-          <mc:Fallback>
-            <w:pict>
-              <v:shapetype w14:anchorId="2EB75DA9" id="_x0000_t202" coordsize="21600,21600" o:spt="202" path="m,l,21600r21600,l21600,xe">
-                <v:stroke joinstyle="miter"/>
-                <v:path gradientshapeok="t" o:connecttype="rect"/>
-              </v:shapetype>
-              <v:shape id="Text Box 2" o:spid="_x0000_s1026" type="#_x0000_t202" style="position:absolute;left:0;text-align:left;margin-left:13.1pt;margin-top:165.25pt;width:429pt;height:110.6pt;z-index:251659264;visibility:visible;mso-wrap-style:square;mso-width-percent:0;mso-height-percent:200;mso-wrap-distance-left:9pt;mso-wrap-distance-top:3.6pt;mso-wrap-distance-right:9pt;mso-wrap-distance-bottom:3.6pt;mso-position-horizontal:absolute;mso-position-horizontal-relative:text;mso-position-vertical:absolute;mso-position-vertical-relative:text;mso-width-percent:0;mso-height-percent:200;mso-width-relative:margin;mso-height-relative:margin;v-text-anchor:top" o:gfxdata="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" fillcolor="#d8d8d8 [2732]">
-                <v:textbox style="mso-fit-shape-to-text:t">
-                  <w:txbxContent>
-                    <w:p>
-                      <w:pPr>
-                        <w:ind w:firstLine="0"/>
-                        <w:rPr>
-                          <w:rFonts w:ascii="Consolas" w:hAnsi="Consolas"/>
-                          <w:sz w:val="20"/>
-                          <w:szCs w:val="16"/>
-                        </w:rPr>
-                      </w:pPr>
-                      <w:r>
-                        <w:rPr>
-                          <w:rFonts w:ascii="Consolas" w:hAnsi="Consolas"/>
-                          <w:sz w:val="20"/>
-                          <w:szCs w:val="16"/>
-                        </w:rPr>
-                        <w:t>{</w:t>
-                      </w:r>
-                    </w:p>
-                    <w:p>
-                      <w:pPr>
-                        <w:ind w:left="216" w:firstLine="0"/>
-                        <w:rPr>
-                          <w:rFonts w:ascii="Consolas" w:hAnsi="Consolas"/>
-                          <w:sz w:val="20"/>
-                          <w:szCs w:val="16"/>
-                        </w:rPr>
-                      </w:pPr>
-                      <w:r>
-                        <w:rPr>
-                          <w:rFonts w:ascii="Consolas" w:hAnsi="Consolas"/>
-                          <w:color w:val="C45911" w:themeColor="accent2" w:themeShade="BF"/>
-                          <w:sz w:val="20"/>
-                          <w:szCs w:val="16"/>
-                        </w:rPr>
-                        <w:t>"transform"</w:t>
-                      </w:r>
-                      <w:r>
-                        <w:rPr>
-                          <w:rFonts w:ascii="Consolas" w:hAnsi="Consolas"/>
-                          <w:sz w:val="20"/>
-                          <w:szCs w:val="16"/>
-                        </w:rPr>
-                        <w:t xml:space="preserve">: </w:t>
-                      </w:r>
-                      <w:r>
-                        <w:rPr>
-                          <w:rFonts w:ascii="Consolas" w:hAnsi="Consolas"/>
-                          <w:color w:val="538135" w:themeColor="accent6" w:themeShade="BF"/>
-                          <w:sz w:val="20"/>
-                          <w:szCs w:val="16"/>
-                        </w:rPr>
-                        <w:t>"A single string describing, in detail, the part of the objective that transforms the data. Results are in '</w:t>
-                      </w:r>
-                      <w:proofErr w:type="spellStart"/>
-                      <w:r>
-                        <w:rPr>
-                          <w:rFonts w:ascii="Consolas" w:hAnsi="Consolas"/>
-                          <w:color w:val="538135" w:themeColor="accent6" w:themeShade="BF"/>
-                          <w:sz w:val="20"/>
-                          <w:szCs w:val="16"/>
-                        </w:rPr>
-                        <w:t>transformed_gdf</w:t>
-                      </w:r>
-                      <w:proofErr w:type="spellEnd"/>
-                      <w:r>
-                        <w:rPr>
-                          <w:rFonts w:ascii="Consolas" w:hAnsi="Consolas"/>
-                          <w:color w:val="538135" w:themeColor="accent6" w:themeShade="BF"/>
-                          <w:sz w:val="20"/>
-                          <w:szCs w:val="16"/>
-                        </w:rPr>
-                        <w:t xml:space="preserve">' </w:t>
-                      </w:r>
-                      <w:proofErr w:type="spellStart"/>
-                      <w:r>
-                        <w:rPr>
-                          <w:rFonts w:ascii="Consolas" w:hAnsi="Consolas"/>
-                          <w:color w:val="538135" w:themeColor="accent6" w:themeShade="BF"/>
-                          <w:sz w:val="20"/>
-                          <w:szCs w:val="16"/>
-                        </w:rPr>
-                        <w:t>GeoDataFrame</w:t>
-                      </w:r>
-                      <w:proofErr w:type="spellEnd"/>
-                      <w:r>
-                        <w:rPr>
-                          <w:rFonts w:ascii="Consolas" w:hAnsi="Consolas"/>
-                          <w:color w:val="538135" w:themeColor="accent6" w:themeShade="BF"/>
-                          <w:sz w:val="20"/>
-                          <w:szCs w:val="16"/>
-                        </w:rPr>
-                        <w:t>. Include specific column names and operations. Do NOT include any code."</w:t>
-                      </w:r>
-                      <w:r>
-                        <w:rPr>
-                          <w:rFonts w:ascii="Consolas" w:hAnsi="Consolas"/>
-                          <w:sz w:val="20"/>
-                          <w:szCs w:val="16"/>
-                        </w:rPr>
-                        <w:t>,</w:t>
-                      </w:r>
-                    </w:p>
-                    <w:p>
-                      <w:pPr>
-                        <w:ind w:left="284" w:firstLine="0"/>
-                        <w:rPr>
-                          <w:rFonts w:ascii="Consolas" w:hAnsi="Consolas"/>
-                          <w:sz w:val="20"/>
-                          <w:szCs w:val="16"/>
-                        </w:rPr>
-                      </w:pPr>
-                      <w:r>
-                        <w:rPr>
-                          <w:rFonts w:ascii="Consolas" w:hAnsi="Consolas"/>
-                          <w:color w:val="C45911" w:themeColor="accent2" w:themeShade="BF"/>
-                          <w:sz w:val="20"/>
-                          <w:szCs w:val="16"/>
-                        </w:rPr>
-                        <w:t>"visualize"</w:t>
-                      </w:r>
-                      <w:r>
-                        <w:rPr>
-                          <w:rFonts w:ascii="Consolas" w:hAnsi="Consolas"/>
-                          <w:sz w:val="20"/>
-                          <w:szCs w:val="16"/>
-                        </w:rPr>
-                        <w:t xml:space="preserve">: </w:t>
-                      </w:r>
-                      <w:r>
-                        <w:rPr>
-                          <w:rFonts w:ascii="Consolas" w:hAnsi="Consolas"/>
-                          <w:color w:val="538135" w:themeColor="accent6" w:themeShade="BF"/>
-                          <w:sz w:val="20"/>
-                          <w:szCs w:val="16"/>
-                        </w:rPr>
-                        <w:t>"A single string describing, in detail, the part of the objective that visualizes specified data from '</w:t>
-                      </w:r>
-                      <w:proofErr w:type="spellStart"/>
-                      <w:r>
-                        <w:rPr>
-                          <w:rFonts w:ascii="Consolas" w:hAnsi="Consolas"/>
-                          <w:color w:val="538135" w:themeColor="accent6" w:themeShade="BF"/>
-                          <w:sz w:val="20"/>
-                          <w:szCs w:val="16"/>
-                        </w:rPr>
-                        <w:t>transformed_gdf</w:t>
-                      </w:r>
-                      <w:proofErr w:type="spellEnd"/>
-                      <w:r>
-                        <w:rPr>
-                          <w:rFonts w:ascii="Consolas" w:hAnsi="Consolas"/>
-                          <w:color w:val="538135" w:themeColor="accent6" w:themeShade="BF"/>
-                          <w:sz w:val="20"/>
-                          <w:szCs w:val="16"/>
-                        </w:rPr>
-                        <w:t xml:space="preserve">' </w:t>
-                      </w:r>
-                      <w:proofErr w:type="spellStart"/>
-                      <w:r>
-                        <w:rPr>
-                          <w:rFonts w:ascii="Consolas" w:hAnsi="Consolas"/>
-                          <w:color w:val="538135" w:themeColor="accent6" w:themeShade="BF"/>
-                          <w:sz w:val="20"/>
-                          <w:szCs w:val="16"/>
-                        </w:rPr>
-                        <w:t>GeoDataFrame</w:t>
-                      </w:r>
-                      <w:proofErr w:type="spellEnd"/>
-                      <w:r>
-                        <w:rPr>
-                          <w:rFonts w:ascii="Consolas" w:hAnsi="Consolas"/>
-                          <w:color w:val="538135" w:themeColor="accent6" w:themeShade="BF"/>
-                          <w:sz w:val="20"/>
-                          <w:szCs w:val="16"/>
-                        </w:rPr>
-                        <w:t>. Visualizations may include printing some result, outputting graphs or overlaying some data on map of Europe. Include specific column names and operations. Do NOT include any code."</w:t>
-                      </w:r>
-                    </w:p>
-                    <w:p>
-                      <w:pPr>
-                        <w:ind w:firstLine="0"/>
-                        <w:rPr>
-                          <w:rFonts w:ascii="Consolas" w:hAnsi="Consolas"/>
-                          <w:sz w:val="20"/>
-                          <w:szCs w:val="16"/>
-                        </w:rPr>
-                      </w:pPr>
-                      <w:r>
-                        <w:rPr>
-                          <w:rFonts w:ascii="Consolas" w:hAnsi="Consolas"/>
-                          <w:sz w:val="20"/>
-                          <w:szCs w:val="16"/>
-                        </w:rPr>
-                        <w:t>}</w:t>
-                      </w:r>
-                    </w:p>
-                  </w:txbxContent>
-                </v:textbox>
-                <w10:wrap type="topAndBottom"/>
-              </v:shape>
-            </w:pict>
-          </mc:Fallback>
-        </mc:AlternateContent>
-      </w:r>
-      <w:r>
-        <w:t>The transform part of the response should contain detailed instructions on what should be done in order to</w:t>
-      </w:r>
-      <w:r>
-        <w:t xml:space="preserve"> </w:t>
-      </w:r>
-      <w:r>
-        <w:t>fully</w:t>
-      </w:r>
-      <w:r>
-        <w:t xml:space="preserve"> prepare the data for the </w:t>
-      </w:r>
-      <w:r>
-        <w:t xml:space="preserve">visualization part. These </w:t>
-      </w:r>
-      <w:r>
-        <w:t xml:space="preserve">instructions should contain </w:t>
-      </w:r>
-      <w:r>
-        <w:t xml:space="preserve">all the steps </w:t>
-      </w:r>
-      <w:r>
-        <w:t xml:space="preserve">that the next LLM </w:t>
-      </w:r>
-      <w:r>
-        <w:t xml:space="preserve">needs to write the python code </w:t>
-      </w:r>
-      <w:r>
-        <w:t>for.</w:t>
-      </w:r>
-      <w:r>
-        <w:t xml:space="preserve"> It should contain expressions like “keep only </w:t>
-      </w:r>
-      <w:r>
-        <w:t>x and y columns”, “filter the data with x less than 4”, “</w:t>
-      </w:r>
-      <w:r>
-        <w:t>group the data by x and return</w:t>
-      </w:r>
-      <w:r>
-        <w:t xml:space="preserve"> mean </w:t>
-      </w:r>
-      <w:r>
-        <w:t xml:space="preserve">value by group only for groups that have more than 4 </w:t>
-      </w:r>
-      <w:r>
-        <w:t>entries” etc.</w:t>
-      </w:r>
-      <w:r>
-        <w:t xml:space="preserve"> </w:t>
-      </w:r>
-      <w:r>
-        <w:t>This modular and detailed approach ensures that the transformation is explicitly defined and aligns with the user’s intent.</w:t>
-      </w:r>
-      <w:r>
-        <w:t xml:space="preserve"> </w:t>
-      </w:r>
-      <w:r>
-        <w:t xml:space="preserve">The visualize part of the response should contain </w:t>
-      </w:r>
-      <w:r>
-        <w:t xml:space="preserve">only the instructions on how </w:t>
-      </w:r>
-      <w:r>
-        <w:t>the processed data should</w:t>
-      </w:r>
-      <w:r>
-        <w:t xml:space="preserve"> be displayed</w:t>
-      </w:r>
-      <w:r>
-        <w:t xml:space="preserve"> –</w:t>
-      </w:r>
-      <w:r>
-        <w:t xml:space="preserve"> </w:t>
-      </w:r>
-      <w:r>
-        <w:t>whether the</w:t>
-      </w:r>
-      <w:r>
-        <w:t xml:space="preserve"> code the LLM will write should plot some graph</w:t>
-      </w:r>
-      <w:r>
-        <w:t>, only print a value or something else.</w:t>
-      </w:r>
-      <w:r>
-        <w:t xml:space="preserve"> </w:t>
-      </w:r>
-      <w:r>
-        <w:t>By isolating transformation from visualization, the process becomes more structured and easier to debug or extend.</w:t>
+        <w:t>From the response of the Coder LLM we extract the python code and clean it by removing all the comments, import statements, print statements and the empty lines. This cleaning step ensures that the code is streamlined and free of unnecessary clutter, making it more reliable and efficient for execution. After cleaning the code, we execute it and retrieve the description of the data by calling pandas.Dataframe.info() function. This intermediate validation step guarantees that the visualization LLM receives accurate information about the transformed dataset, avoiding potential mismatches between transformation and visualization phases.</w:t>
       </w:r>
     </w:p>
     <w:p>
       <w:pPr>
         <w:ind w:firstLine="0"/>
       </w:pPr>
+      <w:r>
+        <w:t xml:space="preserve">In parallel we can also execute the </w:t>
+      </w:r>
+      <w:r>
+        <w:t xml:space="preserve">call to </w:t>
+      </w:r>
+      <w:r>
+        <w:t>Instruct</w:t>
+      </w:r>
+      <w:r>
+        <w:t xml:space="preserve"> LLM which will retrieve the type of </w:t>
+      </w:r>
+      <w:r>
+        <w:t>visualization,</w:t>
+      </w:r>
+      <w:r>
+        <w:t xml:space="preserve"> </w:t>
+      </w:r>
+      <w:r>
+        <w:t xml:space="preserve">and </w:t>
+      </w:r>
+      <w:r>
+        <w:t xml:space="preserve">the response </w:t>
+      </w:r>
+      <w:r>
+        <w:t xml:space="preserve">will be used </w:t>
+      </w:r>
+      <w:r>
+        <w:t xml:space="preserve">as input to the visualization Coder LLM. </w:t>
+      </w:r>
+      <w:r>
+        <w:t xml:space="preserve">We need this part of the pipeline since we noticed that </w:t>
+      </w:r>
+      <w:r>
+        <w:t xml:space="preserve">Coder LLM we use </w:t>
+      </w:r>
+      <w:r>
+        <w:t>for visualization</w:t>
+      </w:r>
+      <w:r>
+        <w:t xml:space="preserve"> </w:t>
+      </w:r>
+      <w:r>
+        <w:t xml:space="preserve">is </w:t>
+      </w:r>
+      <w:r>
+        <w:t xml:space="preserve">sometimes </w:t>
+      </w:r>
+      <w:r>
+        <w:t xml:space="preserve">struggling to </w:t>
+      </w:r>
+      <w:r>
+        <w:t xml:space="preserve">conclude how </w:t>
+      </w:r>
+      <w:r>
+        <w:t>the data should</w:t>
+      </w:r>
+      <w:r>
+        <w:t xml:space="preserve"> </w:t>
+      </w:r>
+      <w:r>
+        <w:t xml:space="preserve">be presented to the user. </w:t>
+      </w:r>
+      <w:r>
+        <w:t xml:space="preserve">Doing one additional call to the Instruct LLM significantly reduces the </w:t>
+      </w:r>
+      <w:r>
+        <w:t>errors we experienced while</w:t>
+      </w:r>
+      <w:r>
+        <w:t xml:space="preserve"> having Coder LLM decide how to present the data.</w:t>
+      </w:r>
+      <w:r>
+        <w:t xml:space="preserve"> </w:t>
+      </w:r>
+      <w:r>
+        <w:t xml:space="preserve">In system query </w:t>
+      </w:r>
+      <w:r>
+        <w:t>tell the LLM to return only one of the following:</w:t>
+      </w:r>
     </w:p>
     <w:p>
       <w:pPr>
         <w:ind w:firstLine="0"/>
       </w:pPr>
-      <w:r>
-        <w:t xml:space="preserve">Once we </w:t>
-      </w:r>
-      <w:r>
-        <w:t>receive</w:t>
-      </w:r>
-      <w:r>
-        <w:t xml:space="preserve"> the </w:t>
-      </w:r>
-      <w:r>
-        <w:t>response</w:t>
-      </w:r>
-      <w:r>
-        <w:t xml:space="preserve"> from </w:t>
-      </w:r>
-      <w:proofErr w:type="gramStart"/>
-      <w:r>
-        <w:t>the Instruction</w:t>
-      </w:r>
-      <w:proofErr w:type="gramEnd"/>
-      <w:r>
-        <w:t xml:space="preserve"> LLM, we pass the trans</w:t>
-      </w:r>
-      <w:r>
-        <w:t xml:space="preserve">form instructions to the Coder LLM. This request is </w:t>
-      </w:r>
-      <w:r>
-        <w:t xml:space="preserve">also enriched with the system query. </w:t>
-      </w:r>
-      <w:r>
-        <w:t xml:space="preserve">It </w:t>
-      </w:r>
-      <w:r>
-        <w:t xml:space="preserve">contains the description of the dataset </w:t>
-      </w:r>
-      <w:r>
-        <w:t>in exactly the same way as the instruction prompt</w:t>
-      </w:r>
-      <w:r>
-        <w:t xml:space="preserve"> and </w:t>
-      </w:r>
-      <w:r>
-        <w:t xml:space="preserve">we also add the list of the available pandas functions we suggest </w:t>
-      </w:r>
-      <w:r>
-        <w:t xml:space="preserve">it </w:t>
-      </w:r>
-      <w:r>
-        <w:t>to use</w:t>
-      </w:r>
-      <w:r>
-        <w:t>.</w:t>
-      </w:r>
-      <w:r>
-        <w:t xml:space="preserve"> Additionally, we instruct the</w:t>
-      </w:r>
-      <w:r>
-        <w:t xml:space="preserve"> Coder</w:t>
-      </w:r>
-      <w:r>
-        <w:t xml:space="preserve"> LLM only to return the python code without additional text, </w:t>
-      </w:r>
-      <w:r>
-        <w:t xml:space="preserve">tell it where </w:t>
-      </w:r>
-      <w:r>
-        <w:t xml:space="preserve">the data about the </w:t>
-      </w:r>
-      <w:r>
-        <w:t xml:space="preserve">map of Europe is stored and request it to put the final transformation result in </w:t>
-      </w:r>
-      <w:r>
-        <w:t>specified variable.</w:t>
-      </w:r>
-      <w:r>
-        <w:t xml:space="preserve"> </w:t>
-      </w:r>
-      <w:r>
-        <w:t>The preloaded information about where the map of Europe is stored, along with instructions to place the final transformed dataset into a specific variable, further reduces complexity and the risk of error.</w:t>
-      </w:r>
     </w:p>
     <w:p>
       <w:pPr>
-        <w:ind w:firstLine="0"/>
-      </w:pPr>
-      <w:r>
-        <w:t xml:space="preserve">From the response of the </w:t>
-      </w:r>
-      <w:proofErr w:type="gramStart"/>
-      <w:r>
-        <w:t>Coder LLM</w:t>
-      </w:r>
-      <w:proofErr w:type="gramEnd"/>
-      <w:r>
-        <w:t xml:space="preserve"> we extract the </w:t>
-      </w:r>
-      <w:r>
-        <w:t xml:space="preserve">python code and clean it by removing all the comments, </w:t>
-      </w:r>
-      <w:proofErr w:type="gramStart"/>
-      <w:r>
-        <w:t>import</w:t>
-      </w:r>
-      <w:proofErr w:type="gramEnd"/>
-      <w:r>
-        <w:t xml:space="preserve"> statements, print statements and the empty lines.</w:t>
-      </w:r>
-      <w:r>
-        <w:t xml:space="preserve"> </w:t>
-      </w:r>
-      <w:r>
-        <w:t>This cleaning step ensures that the code is streamlined and free of unnecessary clutter, making it more reliable and efficient for execution.</w:t>
-      </w:r>
-      <w:r>
-        <w:t xml:space="preserve"> </w:t>
-      </w:r>
-      <w:r>
-        <w:t xml:space="preserve">After cleaning the </w:t>
-      </w:r>
-      <w:r>
-        <w:t>code,</w:t>
-      </w:r>
-      <w:r>
-        <w:t xml:space="preserve"> we execute it and </w:t>
-      </w:r>
-      <w:r>
-        <w:t xml:space="preserve">retrieve the description of the data by </w:t>
-      </w:r>
-      <w:r>
-        <w:t xml:space="preserve">calling </w:t>
-      </w:r>
-      <w:proofErr w:type="gramStart"/>
-      <w:r>
-        <w:t>pandas.Dataframe.info</w:t>
-      </w:r>
-      <w:r>
-        <w:t>(</w:t>
-      </w:r>
-      <w:proofErr w:type="gramEnd"/>
-      <w:r>
-        <w:t>)</w:t>
-      </w:r>
-      <w:r>
-        <w:t xml:space="preserve"> function. </w:t>
-      </w:r>
-      <w:r>
-        <w:t>This intermediate validation step guarantees that the visualization LLM receives accurate information about the transformed dataset, avoiding potential mismatches between transformation and visualization phases.</w:t>
+        <w:pStyle w:val="ListParagraph"/>
+        <w:numPr>
+          <w:ilvl w:val="0"/>
+          <w:numId w:val="34"/>
+        </w:numPr>
+      </w:pPr>
+      <w:r>
+        <w:rPr>
+          <w:b/>
+          <w:bCs/>
+        </w:rPr>
+        <w:t>print</w:t>
+      </w:r>
+      <w:r>
+        <w:t xml:space="preserve">: </w:t>
+      </w:r>
+      <w:r>
+        <w:t>f</w:t>
+      </w:r>
+      <w:r>
+        <w:t>or simple transformations whose results should be directly printed</w:t>
       </w:r>
     </w:p>
     <w:p>
       <w:pPr>
-        <w:ind w:firstLine="0"/>
-      </w:pPr>
-      <w:r>
-        <w:t xml:space="preserve">As already mentioned, for the </w:t>
-      </w:r>
-      <w:r>
-        <w:t>visualization</w:t>
-      </w:r>
-      <w:r>
-        <w:t xml:space="preserve"> part of the task </w:t>
-      </w:r>
-      <w:r>
-        <w:t>we embed the information about the transformed dataset in the system q</w:t>
-      </w:r>
-      <w:r>
-        <w:t>uery</w:t>
-      </w:r>
-      <w:r>
-        <w:t xml:space="preserve">. Additionally, we add </w:t>
-      </w:r>
-      <w:r>
-        <w:t>the detailed visualization instructions from the Instruction LLM</w:t>
-      </w:r>
-      <w:r>
-        <w:t xml:space="preserve">, the </w:t>
-      </w:r>
-      <w:r>
-        <w:t>description of dataset containing the map of Europe</w:t>
-      </w:r>
-      <w:r>
-        <w:t xml:space="preserve"> that will be preloaded and the list of the functions for visualization we recommend </w:t>
-      </w:r>
-      <w:r>
-        <w:t>using</w:t>
-      </w:r>
-      <w:r>
-        <w:t>.</w:t>
-      </w:r>
-      <w:r>
-        <w:t xml:space="preserve"> </w:t>
-      </w:r>
-      <w:r>
-        <w:t xml:space="preserve">This </w:t>
-      </w:r>
-      <w:r>
-        <w:lastRenderedPageBreak/>
-        <w:t>ensures that the visualization LLM has all the context it needs to generate accurate and effective visualization code. By embedding detailed metadata at every step, the process minimizes user effort and reduces the likelihood of errors.</w:t>
-      </w:r>
-      <w:r>
-        <w:t xml:space="preserve"> </w:t>
-      </w:r>
-      <w:r>
-        <w:t xml:space="preserve">This is the </w:t>
-      </w:r>
-      <w:r>
-        <w:t xml:space="preserve">last request of our </w:t>
-      </w:r>
-      <w:r>
-        <w:t>pipeline,</w:t>
-      </w:r>
-      <w:r>
-        <w:t xml:space="preserve"> and it is sent to </w:t>
-      </w:r>
-      <w:r>
-        <w:t>Coder</w:t>
-      </w:r>
-      <w:r>
-        <w:t xml:space="preserve"> LLM.</w:t>
+        <w:pStyle w:val="ListParagraph"/>
+        <w:numPr>
+          <w:ilvl w:val="0"/>
+          <w:numId w:val="34"/>
+        </w:numPr>
+      </w:pPr>
+      <w:r>
+        <w:rPr>
+          <w:b/>
+          <w:bCs/>
+        </w:rPr>
+        <w:t>graph</w:t>
+      </w:r>
+      <w:r>
+        <w:t xml:space="preserve">: </w:t>
+      </w:r>
+      <w:r>
+        <w:t>f</w:t>
+      </w:r>
+      <w:r>
+        <w:t>or queries that require visualizing transformed data as plots or graphs (e.g., histograms, scatter plots)</w:t>
       </w:r>
     </w:p>
     <w:p>
       <w:pPr>
-        <w:ind w:firstLine="0"/>
-      </w:pPr>
-      <w:r>
-        <w:t>Once we receive the response, we clean the code</w:t>
-      </w:r>
-      <w:r>
-        <w:t xml:space="preserve"> in the same way as we cleaned </w:t>
-      </w:r>
-      <w:r>
-        <w:t xml:space="preserve">the code </w:t>
-      </w:r>
-      <w:r>
-        <w:t>generated for transformation</w:t>
-      </w:r>
-      <w:r>
-        <w:t xml:space="preserve">, </w:t>
-      </w:r>
-      <w:r>
-        <w:t>stack those two codes tog</w:t>
-      </w:r>
-      <w:r>
-        <w:t>ether and run it to retrieve the result.</w:t>
+        <w:pStyle w:val="ListParagraph"/>
+        <w:numPr>
+          <w:ilvl w:val="0"/>
+          <w:numId w:val="34"/>
+        </w:numPr>
+      </w:pPr>
+      <w:r>
+        <w:rPr>
+          <w:b/>
+          <w:bCs/>
+        </w:rPr>
+        <w:t>map</w:t>
+      </w:r>
+      <w:r>
+        <w:t xml:space="preserve">: </w:t>
+      </w:r>
+      <w:r>
+        <w:t>f</w:t>
+      </w:r>
+      <w:r>
+        <w:t>or queries requiring overlaying transformed results on a map of Europe already loaded as a GeoDataFrame (europe_gdf)</w:t>
       </w:r>
     </w:p>
     <w:p>
@@ -1865,17 +1171,226 @@
     </w:p>
     <w:p>
       <w:pPr>
+        <w:ind w:firstLine="0"/>
+      </w:pPr>
+      <w:r>
+        <w:t>For the visualization part of the task</w:t>
+      </w:r>
+      <w:r>
+        <w:t xml:space="preserve">, we have different system queries depending on </w:t>
+      </w:r>
+      <w:r>
+        <w:t>the type</w:t>
+      </w:r>
+      <w:r>
+        <w:t xml:space="preserve"> of visualization we determine in the previous step.</w:t>
+      </w:r>
+      <w:r>
+        <w:t xml:space="preserve"> </w:t>
+      </w:r>
+      <w:r>
+        <w:t>We enrich each of these system queries</w:t>
+      </w:r>
+      <w:r>
+        <w:t xml:space="preserve"> with</w:t>
+      </w:r>
+      <w:r>
+        <w:t xml:space="preserve"> user query,</w:t>
+      </w:r>
+      <w:r>
+        <w:t xml:space="preserve"> </w:t>
+      </w:r>
+      <w:r>
+        <w:t>description of dataset</w:t>
+      </w:r>
+      <w:r>
+        <w:t xml:space="preserve">, and additional information </w:t>
+      </w:r>
+      <w:r>
+        <w:t xml:space="preserve">about what should be considered regarding the type of visualization. </w:t>
+      </w:r>
+      <w:r>
+        <w:t>This ensures that the visualization LLM has all the context it needs to generate accurate and effective visualization code. By embedding detailed metadata at every step, the process minimizes user effort and reduces the likelihood of errors. This is the last request of our pipeline, and it is sent to Coder LLM.</w:t>
+      </w:r>
+    </w:p>
+    <w:p>
+      <w:pPr>
+        <w:ind w:firstLine="0"/>
+      </w:pPr>
+      <w:r>
+        <w:t>Once we receive the response, we clean the code</w:t>
+      </w:r>
+      <w:r>
+        <w:t xml:space="preserve"> in the same way as we cleaned </w:t>
+      </w:r>
+      <w:r>
+        <w:t xml:space="preserve">the code </w:t>
+      </w:r>
+      <w:r>
+        <w:t>generated for transformation</w:t>
+      </w:r>
+      <w:r>
+        <w:t xml:space="preserve">, </w:t>
+      </w:r>
+      <w:r>
+        <w:t>stack those two codes tog</w:t>
+      </w:r>
+      <w:r>
+        <w:t>ether and run it to retrieve the result.</w:t>
+      </w:r>
+    </w:p>
+    <w:p>
+      <w:pPr>
+        <w:ind w:firstLine="0"/>
+      </w:pPr>
+      <w:r>
+        <w:t xml:space="preserve">As shown in the </w:t>
+      </w:r>
+      <w:r>
+        <w:fldChar w:fldCharType="begin"/>
+      </w:r>
+      <w:r>
+        <w:instrText xml:space="preserve"> REF _Ref188906894 \h </w:instrText>
+      </w:r>
+      <w:r>
+        <w:fldChar w:fldCharType="separate"/>
+      </w:r>
+      <w:r>
+        <w:t>Figure 1</w:t>
+      </w:r>
+      <w:r>
+        <w:fldChar w:fldCharType="end"/>
+      </w:r>
+      <w:r>
+        <w:t xml:space="preserve">, each request to the LLM is followed by </w:t>
+      </w:r>
+      <w:r>
+        <w:t xml:space="preserve">a validation step. The validation step after the Coder LLMs </w:t>
+      </w:r>
+      <w:r>
+        <w:t>is trying to execute th</w:t>
+      </w:r>
+      <w:r>
+        <w:t xml:space="preserve">e code retrieved from the LLM. In case </w:t>
+      </w:r>
+      <w:r>
+        <w:t xml:space="preserve">the validation is successful </w:t>
+      </w:r>
+      <w:r>
+        <w:t>the current</w:t>
+      </w:r>
+      <w:r>
+        <w:t xml:space="preserve"> </w:t>
+      </w:r>
+      <w:r>
+        <w:t xml:space="preserve">step is finished and </w:t>
+      </w:r>
+      <w:r>
+        <w:t>the next</w:t>
+      </w:r>
+      <w:r>
+        <w:t xml:space="preserve"> one in the pipeline may </w:t>
+      </w:r>
+      <w:r>
+        <w:lastRenderedPageBreak/>
+        <w:t xml:space="preserve">start. If validation </w:t>
+      </w:r>
+      <w:r>
+        <w:t>fails,</w:t>
+      </w:r>
+      <w:r>
+        <w:t xml:space="preserve"> we </w:t>
+      </w:r>
+      <w:r>
+        <w:t>restart the pipeline from the current step</w:t>
+      </w:r>
+      <w:r>
+        <w:t xml:space="preserve"> but this time with a different system query. </w:t>
+      </w:r>
+      <w:r>
+        <w:t>With the standard</w:t>
+      </w:r>
+      <w:r>
+        <w:t xml:space="preserve"> query parameters for the step</w:t>
+      </w:r>
+      <w:r>
+        <w:t>, t</w:t>
+      </w:r>
+      <w:r>
+        <w:t>his query</w:t>
+      </w:r>
+      <w:r>
+        <w:t xml:space="preserve"> also</w:t>
+      </w:r>
+      <w:r>
+        <w:t xml:space="preserve"> </w:t>
+      </w:r>
+      <w:r>
+        <w:t xml:space="preserve">contains the code from the previous response together with the exception the </w:t>
+      </w:r>
+      <w:r>
+        <w:t xml:space="preserve">code raised during its execution. </w:t>
+      </w:r>
+      <w:r>
+        <w:t>Additionally, it is possible to specify different LLM for the retry steps.</w:t>
+      </w:r>
+      <w:r>
+        <w:t xml:space="preserve"> </w:t>
+      </w:r>
+      <w:r>
+        <w:t>I</w:t>
+      </w:r>
+      <w:r>
+        <w:t xml:space="preserve">f </w:t>
+      </w:r>
+      <w:r>
+        <w:t xml:space="preserve">validation fails </w:t>
+      </w:r>
+      <w:r>
+        <w:t>after the call to the Instruct LLM, w</w:t>
+      </w:r>
+      <w:r>
+        <w:t xml:space="preserve">e simply </w:t>
+      </w:r>
+      <w:r>
+        <w:t>retry the same request.</w:t>
+      </w:r>
+    </w:p>
+    <w:p>
+      <w:pPr>
+        <w:ind w:firstLine="0"/>
+      </w:pPr>
+      <w:r>
+        <w:t xml:space="preserve">This approach enhances reliability by validating each step before moving forward, preventing errors from propagating through the pipeline. By incorporating exception feedback and allowing retries with an adjusted system query or even a different LLM, the </w:t>
+      </w:r>
+      <w:r>
+        <w:t xml:space="preserve">pipeline a has </w:t>
+      </w:r>
+      <w:r>
+        <w:t>higher chance of generating correct and executable cod</w:t>
+      </w:r>
+      <w:r>
+        <w:t>e</w:t>
+      </w:r>
+      <w:r>
+        <w:t>.</w:t>
+      </w:r>
+    </w:p>
+    <w:p>
+      <w:pPr>
+        <w:ind w:firstLine="0"/>
+      </w:pPr>
+    </w:p>
+    <w:p>
+      <w:pPr>
         <w:keepNext/>
       </w:pPr>
       <w:r>
-        <w:rPr>
-          <w:noProof/>
-        </w:rPr>
         <w:drawing>
-          <wp:inline distT="0" distB="0" distL="0" distR="0" wp14:anchorId="219CB928" wp14:editId="3A23727E">
-            <wp:extent cx="5760085" cy="2895600"/>
-            <wp:effectExtent l="0" t="0" r="0" b="0"/>
-            <wp:docPr id="1005729926" name="Picture 1" descr="A screenshot of a computer program&#10;&#10;Description automatically generated"/>
+          <wp:inline distT="0" distB="0" distL="0" distR="0" wp14:anchorId="219CB928" wp14:editId="293D03C1">
+            <wp:extent cx="5569540" cy="2584935"/>
+            <wp:effectExtent l="0" t="0" r="0" b="6350"/>
+            <wp:docPr id="1005729926" name="Picture 1"/>
             <wp:cNvGraphicFramePr>
               <a:graphicFrameLocks xmlns:a="http://schemas.openxmlformats.org/drawingml/2006/main" noChangeAspect="1"/>
             </wp:cNvGraphicFramePr>
@@ -1883,7 +1398,7 @@
               <a:graphicData uri="http://schemas.openxmlformats.org/drawingml/2006/picture">
                 <pic:pic xmlns:pic="http://schemas.openxmlformats.org/drawingml/2006/picture">
                   <pic:nvPicPr>
-                    <pic:cNvPr id="1005729926" name="Picture 1" descr="A screenshot of a computer program&#10;&#10;Description automatically generated"/>
+                    <pic:cNvPr id="1005729926" name="Picture 1"/>
                     <pic:cNvPicPr/>
                   </pic:nvPicPr>
                   <pic:blipFill>
@@ -1901,7 +1416,7 @@
                   <pic:spPr>
                     <a:xfrm>
                       <a:off x="0" y="0"/>
-                      <a:ext cx="5760085" cy="2895600"/>
+                      <a:ext cx="5590237" cy="2594541"/>
                     </a:xfrm>
                     <a:prstGeom prst="rect">
                       <a:avLst/>
@@ -1932,9 +1447,6 @@
         <w:fldChar w:fldCharType="separate"/>
       </w:r>
       <w:r>
-        <w:rPr>
-          <w:noProof/>
-        </w:rPr>
         <w:t>1</w:t>
       </w:r>
       <w:r>
@@ -1950,16 +1462,7 @@
         <w:ind w:firstLine="0"/>
       </w:pPr>
       <w:r>
-        <w:t xml:space="preserve">The proposed approach is </w:t>
-      </w:r>
-      <w:r>
-        <w:t>effective because it breaks the process into clear, modular steps, ensuring clarity and reducing complexity. Embedding detailed metadata and dataset descriptions at each stage enables the LLMs to generate accurate</w:t>
-      </w:r>
-      <w:r>
-        <w:t xml:space="preserve"> and </w:t>
-      </w:r>
-      <w:r>
-        <w:t>context-aware outputs. Intermediate validation, such as inspecting transformed data, ensures alignment between transformation and visualization. By guiding the Coder LLM with curated functions and focusing it solely on code generation, the pipeline produces efficient</w:t>
+        <w:t>The proposed approach is effective because it breaks the process into clear, modular steps, ensuring clarity and reducing complexity. Embedding detailed metadata and dataset descriptions at each stage enables the LLMs to generate accurate and context-aware outputs. Intermediate validation, such as inspecting transformed data, ensures alignment between transformation and visualization. By guiding the Coder LLM with curated functions and focusing it solely on code generation, the pipeline produces efficient</w:t>
       </w:r>
       <w:r>
         <w:t xml:space="preserve"> and</w:t>
@@ -1977,24 +1480,16 @@
         <w:t xml:space="preserve"> also gives an opportunity </w:t>
       </w:r>
       <w:r>
-        <w:t xml:space="preserve">to validate each stage of the code generation independently. The code can be tested and executed </w:t>
-      </w:r>
-      <w:r>
-        <w:t xml:space="preserve">ensuring </w:t>
-      </w:r>
-      <w:r>
-        <w:t xml:space="preserve">correctness at each stage. </w:t>
-      </w:r>
-      <w:r>
-        <w:t xml:space="preserve">We can also implement some retry mechanisms that will retry the query to </w:t>
-      </w:r>
-      <w:proofErr w:type="gramStart"/>
-      <w:r>
-        <w:t>the Coder</w:t>
-      </w:r>
-      <w:proofErr w:type="gramEnd"/>
-      <w:r>
-        <w:t xml:space="preserve"> LLM if </w:t>
+        <w:t xml:space="preserve">to validate each stage of the code generation independently. </w:t>
+      </w:r>
+      <w:r>
+        <w:t>We can also implement some</w:t>
+      </w:r>
+      <w:r>
+        <w:t xml:space="preserve"> additional</w:t>
+      </w:r>
+      <w:r>
+        <w:t xml:space="preserve"> retry mechanisms that will retry the query to the Coder LLM if </w:t>
       </w:r>
       <w:r>
         <w:t>the current</w:t>
@@ -2006,10 +1501,7 @@
         <w:t xml:space="preserve">satisfy </w:t>
       </w:r>
       <w:r>
-        <w:t xml:space="preserve">some requirements. </w:t>
-      </w:r>
-      <w:r>
-        <w:t>For instance, if the transformation code fails or produces unexpected results, the system can automatically request a revised response from the Coder LLM without impacting the subsequent visualization phase.</w:t>
+        <w:t>some requirements.</w:t>
       </w:r>
     </w:p>
     <w:p>
@@ -2052,21 +1544,12 @@
       <w:r>
         <w:t xml:space="preserve"> are obligatory. It is recommended to adjust the body of the paper to the common organization structure of scientific papers – </w:t>
       </w:r>
-      <w:proofErr w:type="spellStart"/>
       <w:r>
         <w:rPr>
           <w:b/>
           <w:i/>
         </w:rPr>
-        <w:t>IMRaD</w:t>
-      </w:r>
-      <w:proofErr w:type="spellEnd"/>
-      <w:r>
-        <w:rPr>
-          <w:b/>
-          <w:i/>
-        </w:rPr>
-        <w:t xml:space="preserve"> - Introduction, Methods, Results, and Discussion).</w:t>
+        <w:t>IMRaD - Introduction, Methods, Results, and Discussion).</w:t>
       </w:r>
       <w:r>
         <w:t xml:space="preserve"> </w:t>
@@ -2087,7 +1570,6 @@
         <w:rPr>
           <w:szCs w:val="28"/>
         </w:rPr>
-        <w:lastRenderedPageBreak/>
         <w:t>Discussion</w:t>
       </w:r>
       <w:r>
@@ -2110,6 +1592,7 @@
     </w:p>
     <w:p>
       <w:r>
+        <w:lastRenderedPageBreak/>
         <w:t xml:space="preserve">5.2 </w:t>
       </w:r>
       <w:r>
@@ -2131,684 +1614,176 @@
     </w:p>
     <w:p>
       <w:pPr>
-        <w:pStyle w:val="TTPSectionHeading"/>
-        <w:ind w:firstLine="0"/>
-        <w:rPr>
-          <w:rFonts w:eastAsia="Times New Roman" w:hint="default"/>
-        </w:rPr>
-      </w:pPr>
-      <w:r>
-        <w:rPr>
-          <w:rFonts w:hint="default"/>
-        </w:rPr>
-        <w:t>R</w:t>
-      </w:r>
-      <w:r>
-        <w:rPr>
-          <w:rFonts w:hint="default"/>
-        </w:rPr>
-        <w:t>eferences</w:t>
-      </w:r>
-      <w:r>
-        <w:rPr>
-          <w:rFonts w:hint="default"/>
-        </w:rPr>
-        <w:t xml:space="preserve"> (TNR 12pt. bold)</w:t>
-      </w:r>
-    </w:p>
-    <w:p>
-      <w:pPr>
-        <w:spacing w:line="360" w:lineRule="auto"/>
-        <w:rPr>
-          <w:szCs w:val="24"/>
-        </w:rPr>
-      </w:pPr>
-      <w:r>
-        <w:rPr>
-          <w:szCs w:val="24"/>
-        </w:rPr>
-        <w:t xml:space="preserve">References in text should have this form (surname, year), for example: </w:t>
-      </w:r>
-    </w:p>
-    <w:p>
-      <w:r>
-        <w:t xml:space="preserve">1 author: </w:t>
-      </w:r>
-      <w:r>
-        <w:tab/>
-      </w:r>
-      <w:r>
-        <w:tab/>
-      </w:r>
-      <w:r>
-        <w:tab/>
-      </w:r>
-      <w:r>
-        <w:tab/>
-      </w:r>
-      <w:r>
-        <w:tab/>
-      </w:r>
-      <w:r>
-        <w:tab/>
-      </w:r>
-      <w:r>
-        <w:t>(</w:t>
-      </w:r>
-      <w:r>
-        <w:t>Krugman</w:t>
-      </w:r>
-      <w:r>
-        <w:t xml:space="preserve">, </w:t>
-      </w:r>
-      <w:r>
-        <w:t>2012)</w:t>
-      </w:r>
-    </w:p>
-    <w:p>
-      <w:r>
-        <w:t>1 author and the same year of publication</w:t>
-      </w:r>
-      <w:proofErr w:type="gramStart"/>
-      <w:r>
-        <w:t xml:space="preserve">: </w:t>
-      </w:r>
-      <w:r>
-        <w:tab/>
-      </w:r>
-      <w:r>
-        <w:t>(</w:t>
-      </w:r>
-      <w:proofErr w:type="gramEnd"/>
-      <w:r>
-        <w:t>Hoffman</w:t>
-      </w:r>
-      <w:r>
-        <w:t xml:space="preserve">, </w:t>
-      </w:r>
-      <w:r>
-        <w:t xml:space="preserve">2012, A), </w:t>
-      </w:r>
-      <w:r>
-        <w:t>(</w:t>
-      </w:r>
-      <w:r>
-        <w:t>Hoffman</w:t>
-      </w:r>
-      <w:r>
-        <w:t xml:space="preserve">, </w:t>
-      </w:r>
-      <w:r>
-        <w:t>2012,</w:t>
-      </w:r>
-      <w:r>
-        <w:t xml:space="preserve"> </w:t>
-      </w:r>
-      <w:r>
-        <w:t>B)</w:t>
-      </w:r>
-    </w:p>
-    <w:p>
-      <w:r>
-        <w:t xml:space="preserve">2 authors: </w:t>
-      </w:r>
-      <w:r>
-        <w:tab/>
-      </w:r>
-      <w:r>
-        <w:tab/>
-      </w:r>
-      <w:r>
-        <w:tab/>
-      </w:r>
-      <w:r>
-        <w:tab/>
-      </w:r>
-      <w:r>
-        <w:tab/>
-      </w:r>
-      <w:r>
-        <w:tab/>
-      </w:r>
-      <w:r>
-        <w:t>(</w:t>
-      </w:r>
-      <w:r>
-        <w:t>Krugman</w:t>
-      </w:r>
-      <w:r>
-        <w:t xml:space="preserve"> </w:t>
-      </w:r>
-      <w:r>
-        <w:t xml:space="preserve">&amp; </w:t>
-      </w:r>
-      <w:r>
-        <w:t>Hoffman</w:t>
-      </w:r>
-      <w:r>
-        <w:t xml:space="preserve">, </w:t>
-      </w:r>
-      <w:r>
-        <w:t>2014)</w:t>
-      </w:r>
-    </w:p>
-    <w:p>
-      <w:r>
-        <w:t xml:space="preserve">3 authors: </w:t>
-      </w:r>
-      <w:r>
-        <w:tab/>
-      </w:r>
-      <w:r>
-        <w:tab/>
-      </w:r>
-      <w:r>
-        <w:tab/>
-      </w:r>
-      <w:r>
-        <w:tab/>
-      </w:r>
-      <w:r>
-        <w:tab/>
-      </w:r>
-      <w:r>
-        <w:tab/>
-      </w:r>
-      <w:r>
-        <w:t>(</w:t>
-      </w:r>
-      <w:r>
-        <w:t>Hoffman</w:t>
-      </w:r>
-      <w:r>
-        <w:t xml:space="preserve"> et al</w:t>
-      </w:r>
-      <w:r>
-        <w:t xml:space="preserve">., </w:t>
-      </w:r>
-      <w:r>
-        <w:t>2012)</w:t>
-      </w:r>
-    </w:p>
-    <w:p>
-      <w:pPr>
-        <w:pStyle w:val="Heading3"/>
+        <w:pStyle w:val="Heading1"/>
         <w:numPr>
           <w:ilvl w:val="0"/>
           <w:numId w:val="0"/>
         </w:numPr>
-        <w:spacing w:before="360"/>
-        <w:rPr>
-          <w:sz w:val="28"/>
+        <w:ind w:left="432" w:hanging="432"/>
+        <w:rPr>
           <w:szCs w:val="24"/>
         </w:rPr>
       </w:pPr>
       <w:r>
         <w:rPr>
-          <w:sz w:val="28"/>
           <w:szCs w:val="24"/>
         </w:rPr>
         <w:t>References</w:t>
-      </w:r>
-      <w:r>
-        <w:rPr>
-          <w:sz w:val="28"/>
-          <w:szCs w:val="24"/>
-        </w:rPr>
-        <w:t xml:space="preserve"> </w:t>
-      </w:r>
-      <w:r>
-        <w:rPr>
-          <w:szCs w:val="28"/>
-        </w:rPr>
-        <w:t>(</w:t>
-      </w:r>
-      <w:r>
-        <w:rPr>
-          <w:sz w:val="28"/>
-          <w:szCs w:val="32"/>
-        </w:rPr>
-        <w:t>TNR 14pt., bold)</w:t>
       </w:r>
     </w:p>
     <w:p>
-      <w:r>
-        <w:t xml:space="preserve">For each work shown in the list of </w:t>
-      </w:r>
-      <w:proofErr w:type="gramStart"/>
-      <w:r>
-        <w:t>references</w:t>
-      </w:r>
-      <w:proofErr w:type="gramEnd"/>
-      <w:r>
-        <w:t xml:space="preserve"> must be a reference in the text.  </w:t>
-      </w:r>
-      <w:r>
-        <w:t>All citations in the text and all references must meet APA styles (American Psychological Association</w:t>
-      </w:r>
-      <w:r>
-        <w:t xml:space="preserve"> </w:t>
-      </w:r>
-      <w:r>
-        <w:t>7</w:t>
-      </w:r>
-      <w:r>
-        <w:t xml:space="preserve">th edition – more information </w:t>
-      </w:r>
-      <w:hyperlink r:id="rId9" w:history="1">
-        <w:r>
-          <w:t>http://www.apastyle.org/</w:t>
-        </w:r>
-      </w:hyperlink>
-      <w:r>
-        <w:t xml:space="preserve">). </w:t>
-      </w:r>
-    </w:p>
-    <w:p/>
-    <w:p>
-      <w:pPr>
-        <w:pStyle w:val="ReferencesText"/>
-        <w:spacing w:before="120" w:after="0"/>
-        <w:rPr>
-          <w:sz w:val="24"/>
-        </w:rPr>
-      </w:pPr>
-      <w:r>
-        <w:rPr>
-          <w:b/>
-          <w:sz w:val="24"/>
-        </w:rPr>
-        <w:t xml:space="preserve">(Book style - </w:t>
-      </w:r>
-      <w:r>
-        <w:rPr>
-          <w:sz w:val="24"/>
-        </w:rPr>
-        <w:t xml:space="preserve">Author, year. </w:t>
-      </w:r>
-      <w:r>
-        <w:rPr>
-          <w:i/>
-          <w:sz w:val="24"/>
-        </w:rPr>
-        <w:t>Title (in italics).</w:t>
-      </w:r>
-      <w:r>
-        <w:rPr>
-          <w:sz w:val="24"/>
-        </w:rPr>
-        <w:t xml:space="preserve"> Publisher, location of publisher.</w:t>
-      </w:r>
-      <w:r>
-        <w:rPr>
-          <w:b/>
-          <w:sz w:val="24"/>
-        </w:rPr>
-        <w:t>)</w:t>
+      <w:pPr>
+        <w:pStyle w:val="Bibliography"/>
+        <w:ind w:left="720" w:hanging="720"/>
+        <w:rPr>
+          <w:szCs w:val="24"/>
+        </w:rPr>
+      </w:pPr>
+      <w:r>
+        <w:fldChar w:fldCharType="begin"/>
+      </w:r>
+      <w:r>
+        <w:instrText xml:space="preserve"> BIBLIOGRAPHY  \l 1050 </w:instrText>
+      </w:r>
+      <w:r>
+        <w:fldChar w:fldCharType="separate"/>
+      </w:r>
+      <w:r>
+        <w:t>Akinboyewa, T., Ning, H., Lessani, M. N., &amp; Li, Z. (2024). Automated Floodwater Depth Estimation Using Large Multimodal Model for Rapid Flood Mapping.</w:t>
       </w:r>
     </w:p>
     <w:p>
       <w:pPr>
-        <w:pStyle w:val="References"/>
-        <w:numPr>
-          <w:ilvl w:val="0"/>
-          <w:numId w:val="0"/>
-        </w:numPr>
-        <w:ind w:left="180" w:hanging="180"/>
-        <w:rPr>
-          <w:sz w:val="24"/>
-          <w:szCs w:val="24"/>
-        </w:rPr>
-      </w:pPr>
-      <w:r>
-        <w:rPr>
-          <w:sz w:val="24"/>
-          <w:szCs w:val="24"/>
-        </w:rPr>
-        <w:t xml:space="preserve">Cichocki, A. and </w:t>
-      </w:r>
-      <w:proofErr w:type="spellStart"/>
-      <w:r>
-        <w:rPr>
-          <w:sz w:val="24"/>
-          <w:szCs w:val="24"/>
-        </w:rPr>
-        <w:t>Unbehaven</w:t>
-      </w:r>
-      <w:proofErr w:type="spellEnd"/>
-      <w:r>
-        <w:rPr>
-          <w:sz w:val="24"/>
-          <w:szCs w:val="24"/>
-        </w:rPr>
-        <w:t xml:space="preserve">, R., (1993). </w:t>
+        <w:pStyle w:val="Bibliography"/>
+        <w:ind w:left="720" w:hanging="720"/>
+      </w:pPr>
+      <w:r>
+        <w:t xml:space="preserve">Feng, Y., Brenner, C., &amp; Sester, M. (2020). Flood severity mapping from Volunteered Geographic Information by interpreting water level from images containing people: A case study of Hurricane Harvey. </w:t>
       </w:r>
       <w:r>
         <w:rPr>
           <w:i/>
-          <w:sz w:val="24"/>
-          <w:szCs w:val="24"/>
-        </w:rPr>
-        <w:t>Neural Networks for Optimization and Signal Processing</w:t>
-      </w:r>
-      <w:r>
-        <w:rPr>
-          <w:sz w:val="24"/>
-          <w:szCs w:val="24"/>
-        </w:rPr>
-        <w:t>, 1st ed. Chichester, U.K.: Wiley.</w:t>
+          <w:iCs/>
+        </w:rPr>
+        <w:t>ISPRS Journal of Photogrammetry and Remote Sensing</w:t>
+      </w:r>
+      <w:r>
+        <w:t>.</w:t>
       </w:r>
     </w:p>
     <w:p>
       <w:pPr>
-        <w:pStyle w:val="References"/>
-        <w:numPr>
-          <w:ilvl w:val="0"/>
-          <w:numId w:val="0"/>
-        </w:numPr>
-        <w:ind w:left="180" w:hanging="180"/>
-        <w:rPr>
-          <w:sz w:val="24"/>
-          <w:szCs w:val="24"/>
-        </w:rPr>
-      </w:pPr>
-      <w:r>
-        <w:rPr>
-          <w:sz w:val="24"/>
-          <w:szCs w:val="24"/>
-        </w:rPr>
-        <w:t xml:space="preserve">Chen, W. K. (1993). </w:t>
-      </w:r>
-      <w:r>
-        <w:rPr>
-          <w:i/>
-          <w:sz w:val="24"/>
-          <w:szCs w:val="24"/>
-        </w:rPr>
-        <w:t>Linear Networks and Systems</w:t>
-      </w:r>
-      <w:r>
-        <w:rPr>
-          <w:sz w:val="24"/>
-          <w:szCs w:val="24"/>
-        </w:rPr>
-        <w:t>, Belmont, CA: Wadsworth, pp. 123-135.</w:t>
+        <w:pStyle w:val="Bibliography"/>
+        <w:ind w:left="720" w:hanging="720"/>
+      </w:pPr>
+      <w:r>
+        <w:t>Fernandez, A., &amp; Dube, S. (2023). Core Building Blocks: Next Gen Geo Spatial GPT Application.</w:t>
       </w:r>
     </w:p>
     <w:p>
       <w:pPr>
-        <w:pStyle w:val="ReferencesText"/>
-        <w:spacing w:before="120" w:after="0"/>
-        <w:rPr>
-          <w:b/>
-          <w:sz w:val="24"/>
-        </w:rPr>
-      </w:pPr>
-      <w:r>
-        <w:rPr>
-          <w:b/>
-          <w:sz w:val="24"/>
-        </w:rPr>
-        <w:t xml:space="preserve">(Journal - </w:t>
-      </w:r>
-      <w:r>
-        <w:rPr>
-          <w:sz w:val="24"/>
-        </w:rPr>
-        <w:t xml:space="preserve">Author, year. Paper title. </w:t>
-      </w:r>
-      <w:r>
-        <w:rPr>
-          <w:i/>
-          <w:sz w:val="24"/>
-        </w:rPr>
-        <w:t>Journal name (in italics)</w:t>
-      </w:r>
-      <w:r>
-        <w:rPr>
-          <w:sz w:val="24"/>
-        </w:rPr>
-        <w:t>, volume and issue numbers, inclusive pages.</w:t>
-      </w:r>
-      <w:r>
-        <w:rPr>
-          <w:b/>
-          <w:sz w:val="24"/>
-        </w:rPr>
-        <w:t xml:space="preserve">) </w:t>
+        <w:pStyle w:val="Bibliography"/>
+        <w:ind w:left="720" w:hanging="720"/>
+      </w:pPr>
+      <w:r>
+        <w:t>Han, B. A., Varshney, K. R., LaDeau, S., Subramaniam, A., Weathers, K. C., &amp; Zwart, J. (2023). A synergistic future for AI and ecology.</w:t>
       </w:r>
     </w:p>
     <w:p>
       <w:pPr>
-        <w:pStyle w:val="References"/>
-        <w:numPr>
-          <w:ilvl w:val="0"/>
-          <w:numId w:val="0"/>
-        </w:numPr>
-        <w:ind w:left="180" w:hanging="180"/>
-        <w:rPr>
-          <w:sz w:val="24"/>
-          <w:szCs w:val="24"/>
-        </w:rPr>
-      </w:pPr>
-      <w:r>
-        <w:rPr>
-          <w:sz w:val="24"/>
-          <w:szCs w:val="24"/>
-        </w:rPr>
-        <w:t xml:space="preserve">Chen, S., Mulgrew, B. and Granta, P. M. (1993). “A clustering technique for digital communications channel equalization using radial basis function networks,” </w:t>
+        <w:pStyle w:val="Bibliography"/>
+        <w:ind w:left="720" w:hanging="720"/>
+      </w:pPr>
+      <w:r>
+        <w:t xml:space="preserve">Hu, Y., Mai, G., Cundy, C., Choi, K., Lao, N., Liu, W., &amp; et al. (2023). Geo-knowledge-guided GPT models improve the extraction of location descriptions from disaster-related social media messages. </w:t>
       </w:r>
       <w:r>
         <w:rPr>
           <w:i/>
           <w:iCs/>
-          <w:sz w:val="24"/>
-          <w:szCs w:val="24"/>
-        </w:rPr>
-        <w:t>IEEE Trans. on Neural Networks</w:t>
-      </w:r>
-      <w:r>
-        <w:rPr>
-          <w:sz w:val="24"/>
-          <w:szCs w:val="24"/>
-        </w:rPr>
-        <w:t xml:space="preserve">, vol. 4, pp. 570-578. </w:t>
+        </w:rPr>
+        <w:t>International Journal of Geographical Information Science</w:t>
+      </w:r>
+      <w:r>
+        <w:t>.</w:t>
       </w:r>
     </w:p>
     <w:p>
       <w:pPr>
-        <w:pStyle w:val="References"/>
-        <w:numPr>
-          <w:ilvl w:val="0"/>
-          <w:numId w:val="0"/>
-        </w:numPr>
-        <w:ind w:left="180" w:hanging="180"/>
-        <w:rPr>
-          <w:sz w:val="24"/>
-          <w:szCs w:val="24"/>
-        </w:rPr>
-      </w:pPr>
-      <w:r>
-        <w:rPr>
-          <w:sz w:val="24"/>
-          <w:szCs w:val="24"/>
-        </w:rPr>
-        <w:t xml:space="preserve">Hill, R. M. (1997). The single-vendor single-buyer integrated production–inventory model with a generalized policy, </w:t>
-      </w:r>
-      <w:r>
-        <w:rPr>
-          <w:i/>
-          <w:sz w:val="24"/>
-          <w:szCs w:val="24"/>
-        </w:rPr>
-        <w:t>European Journal of Operational Research</w:t>
-      </w:r>
-      <w:r>
-        <w:rPr>
-          <w:sz w:val="24"/>
-          <w:szCs w:val="24"/>
-        </w:rPr>
-        <w:t>, vol. 97, pp. 493-499.</w:t>
+        <w:pStyle w:val="Bibliography"/>
+        <w:ind w:left="720" w:hanging="720"/>
+      </w:pPr>
+      <w:r>
+        <w:t>Jang, K. M., Chen, J., Kang, Y., Kim, J., Lee, J., &amp; Duarte, F. (2023). Understanding Place Identity with Generative AI.</w:t>
       </w:r>
     </w:p>
     <w:p>
       <w:pPr>
-        <w:ind w:firstLine="0"/>
-        <w:rPr>
-          <w:szCs w:val="24"/>
-        </w:rPr>
-      </w:pPr>
-      <w:r>
-        <w:rPr>
-          <w:b/>
-          <w:szCs w:val="24"/>
-        </w:rPr>
-        <w:t>(Online Sources style)</w:t>
+        <w:pStyle w:val="Bibliography"/>
+        <w:ind w:left="720" w:hanging="720"/>
+        <w:rPr>
+          <w:lang w:val="hr-HR"/>
+        </w:rPr>
+      </w:pPr>
+      <w:r>
+        <w:rPr>
+          <w:lang w:val="hr-HR"/>
+        </w:rPr>
+        <w:t xml:space="preserve">Li, Z., &amp; Ning, H. (2023). Autonomous GIS: the next-generation AI-powered GIS. </w:t>
+      </w:r>
+      <w:r>
+        <w:rPr>
+          <w:i/>
+          <w:iCs/>
+          <w:lang w:val="hr-HR"/>
+        </w:rPr>
+        <w:t>International Journal of Digital Earth</w:t>
+      </w:r>
+      <w:r>
+        <w:rPr>
+          <w:lang w:val="hr-HR"/>
+        </w:rPr>
+        <w:t>.</w:t>
       </w:r>
     </w:p>
     <w:p>
       <w:pPr>
-        <w:pStyle w:val="References"/>
-        <w:numPr>
-          <w:ilvl w:val="0"/>
-          <w:numId w:val="0"/>
-        </w:numPr>
-        <w:ind w:left="180" w:hanging="180"/>
-      </w:pPr>
-      <w:r>
-        <w:rPr>
-          <w:sz w:val="24"/>
-          <w:szCs w:val="24"/>
-        </w:rPr>
-        <w:t xml:space="preserve">Vidmar, R. J. (August 1992). On the use of atmospheric plasmas as electromagnetic reflectors. IEEE Trans. Plasma Sci. [Online]. 21(3). pp. 876-880. Available: </w:t>
-      </w:r>
-      <w:hyperlink r:id="rId10" w:history="1">
-        <w:r>
-          <w:rPr>
-            <w:rStyle w:val="Hyperlink"/>
-            <w:sz w:val="24"/>
-            <w:szCs w:val="24"/>
-          </w:rPr>
-          <w:t>http://www.halcyon.com/pub/journals/21ps03-vidmar</w:t>
-        </w:r>
-      </w:hyperlink>
+        <w:pStyle w:val="Bibliography"/>
+        <w:ind w:left="720" w:hanging="720"/>
+      </w:pPr>
+      <w:r>
+        <w:t>Mai, G., Huang, W., Sun, J., Song, S., Mishra, D., Liu, N., &amp; et al. (2023). On the Opportunities and Challenges of Foundation Models for Geospatial Artificial Intelligence.</w:t>
+      </w:r>
     </w:p>
     <w:p>
       <w:pPr>
-        <w:pStyle w:val="ReferencesText"/>
-        <w:spacing w:before="120" w:after="0"/>
-        <w:rPr>
-          <w:b/>
-          <w:sz w:val="24"/>
-        </w:rPr>
-      </w:pPr>
-      <w:r>
-        <w:rPr>
-          <w:b/>
-          <w:sz w:val="24"/>
-        </w:rPr>
-        <w:t xml:space="preserve">(Conference paper or contributed volume - </w:t>
-      </w:r>
-      <w:r>
-        <w:rPr>
-          <w:sz w:val="24"/>
-        </w:rPr>
-        <w:t xml:space="preserve">Author, year, paper title. </w:t>
-      </w:r>
-      <w:r>
-        <w:rPr>
-          <w:i/>
-          <w:sz w:val="24"/>
-        </w:rPr>
-        <w:t>Proceedings title (in italics)</w:t>
-      </w:r>
-      <w:r>
-        <w:rPr>
-          <w:sz w:val="24"/>
-        </w:rPr>
-        <w:t>. City, country, inclusive pages.</w:t>
-      </w:r>
-      <w:r>
-        <w:rPr>
-          <w:b/>
-          <w:sz w:val="24"/>
-        </w:rPr>
-        <w:t>)</w:t>
+        <w:pStyle w:val="Bibliography"/>
+        <w:ind w:left="720" w:hanging="720"/>
+      </w:pPr>
+      <w:r>
+        <w:t>Manvi, R., Khanna, S., Mai, G., Burke, M., Lobell, D., &amp; Ermon, S. (2024). GeoLLM: Extracting Geospatial Knowledge from Large Language Models.</w:t>
       </w:r>
     </w:p>
     <w:p>
       <w:pPr>
-        <w:pStyle w:val="References"/>
-        <w:numPr>
-          <w:ilvl w:val="0"/>
-          <w:numId w:val="0"/>
-        </w:numPr>
-        <w:ind w:left="180" w:hanging="180"/>
-        <w:rPr>
-          <w:sz w:val="24"/>
-          <w:szCs w:val="24"/>
-        </w:rPr>
-      </w:pPr>
-      <w:r>
-        <w:rPr>
-          <w:sz w:val="24"/>
-          <w:szCs w:val="24"/>
-        </w:rPr>
-        <w:t xml:space="preserve">Beck, K. and Ralph, J. (1994). Patterns Generates Architectures. </w:t>
-      </w:r>
-      <w:r>
-        <w:rPr>
-          <w:i/>
-          <w:color w:val="000000"/>
-          <w:sz w:val="24"/>
-          <w:szCs w:val="24"/>
-        </w:rPr>
-        <w:t xml:space="preserve"> Proceedings of </w:t>
-      </w:r>
-      <w:r>
-        <w:rPr>
-          <w:i/>
-          <w:sz w:val="24"/>
-          <w:szCs w:val="24"/>
-        </w:rPr>
-        <w:t>European Conference of Object-Oriented Programming.</w:t>
-      </w:r>
-      <w:r>
-        <w:rPr>
-          <w:sz w:val="24"/>
-          <w:szCs w:val="24"/>
-        </w:rPr>
-        <w:t xml:space="preserve"> Bologna, Italy, pp. 139-149.</w:t>
+        <w:pStyle w:val="Bibliography"/>
+        <w:ind w:left="720" w:hanging="720"/>
+      </w:pPr>
+      <w:r>
+        <w:t>Zhang, Y., Wei, C., Wu, S., He, Z., &amp; Yu, W. (2023). GeoGPT: Understanding and Processing Geospatial Tasks through An Autonomous GPT.</w:t>
       </w:r>
     </w:p>
     <w:p>
       <w:pPr>
-        <w:pStyle w:val="References"/>
-        <w:numPr>
-          <w:ilvl w:val="0"/>
-          <w:numId w:val="0"/>
-        </w:numPr>
-        <w:ind w:left="426" w:hanging="426"/>
-        <w:rPr>
-          <w:sz w:val="24"/>
-          <w:szCs w:val="24"/>
-        </w:rPr>
-      </w:pPr>
-    </w:p>
-    <w:p>
-      <w:pPr>
         <w:ind w:firstLine="0"/>
-        <w:rPr>
-          <w:b/>
-          <w:i/>
-          <w:color w:val="FF0000"/>
-          <w:lang w:val="en-GB"/>
-        </w:rPr>
-      </w:pPr>
+      </w:pPr>
+      <w:r>
+        <w:fldChar w:fldCharType="end"/>
+      </w:r>
     </w:p>
     <w:sectPr>
-      <w:footerReference w:type="default" r:id="rId11"/>
-      <w:headerReference w:type="first" r:id="rId12"/>
+      <w:footerReference w:type="default" r:id="rId9"/>
+      <w:headerReference w:type="first" r:id="rId10"/>
       <w:pgSz w:w="11907" w:h="16840" w:code="9"/>
       <w:pgMar w:top="1985" w:right="1418" w:bottom="1418" w:left="1418" w:header="454" w:footer="567" w:gutter="0"/>
       <w:pgNumType w:start="27"/>
@@ -4612,6 +3587,119 @@
     <w:numStyleLink w:val="Style1"/>
   </w:abstractNum>
   <w:abstractNum w:abstractNumId="15" w15:restartNumberingAfterBreak="0">
+    <w:nsid w:val="365B0064"/>
+    <w:multiLevelType w:val="hybridMultilevel"/>
+    <w:tmpl w:val="30D6CCAC"/>
+    <w:lvl w:ilvl="0" w:tplc="04090001">
+      <w:start w:val="1"/>
+      <w:numFmt w:val="bullet"/>
+      <w:lvlText w:val=""/>
+      <w:lvlJc w:val="left"/>
+      <w:pPr>
+        <w:ind w:left="720" w:hanging="360"/>
+      </w:pPr>
+      <w:rPr>
+        <w:rFonts w:ascii="Symbol" w:hAnsi="Symbol" w:hint="default"/>
+      </w:rPr>
+    </w:lvl>
+    <w:lvl w:ilvl="1" w:tplc="04090003" w:tentative="1">
+      <w:start w:val="1"/>
+      <w:numFmt w:val="bullet"/>
+      <w:lvlText w:val="o"/>
+      <w:lvlJc w:val="left"/>
+      <w:pPr>
+        <w:ind w:left="1440" w:hanging="360"/>
+      </w:pPr>
+      <w:rPr>
+        <w:rFonts w:ascii="Courier New" w:hAnsi="Courier New" w:cs="Courier New" w:hint="default"/>
+      </w:rPr>
+    </w:lvl>
+    <w:lvl w:ilvl="2" w:tplc="04090005" w:tentative="1">
+      <w:start w:val="1"/>
+      <w:numFmt w:val="bullet"/>
+      <w:lvlText w:val=""/>
+      <w:lvlJc w:val="left"/>
+      <w:pPr>
+        <w:ind w:left="2160" w:hanging="360"/>
+      </w:pPr>
+      <w:rPr>
+        <w:rFonts w:ascii="Wingdings" w:hAnsi="Wingdings" w:hint="default"/>
+      </w:rPr>
+    </w:lvl>
+    <w:lvl w:ilvl="3" w:tplc="04090001" w:tentative="1">
+      <w:start w:val="1"/>
+      <w:numFmt w:val="bullet"/>
+      <w:lvlText w:val=""/>
+      <w:lvlJc w:val="left"/>
+      <w:pPr>
+        <w:ind w:left="2880" w:hanging="360"/>
+      </w:pPr>
+      <w:rPr>
+        <w:rFonts w:ascii="Symbol" w:hAnsi="Symbol" w:hint="default"/>
+      </w:rPr>
+    </w:lvl>
+    <w:lvl w:ilvl="4" w:tplc="04090003" w:tentative="1">
+      <w:start w:val="1"/>
+      <w:numFmt w:val="bullet"/>
+      <w:lvlText w:val="o"/>
+      <w:lvlJc w:val="left"/>
+      <w:pPr>
+        <w:ind w:left="3600" w:hanging="360"/>
+      </w:pPr>
+      <w:rPr>
+        <w:rFonts w:ascii="Courier New" w:hAnsi="Courier New" w:cs="Courier New" w:hint="default"/>
+      </w:rPr>
+    </w:lvl>
+    <w:lvl w:ilvl="5" w:tplc="04090005" w:tentative="1">
+      <w:start w:val="1"/>
+      <w:numFmt w:val="bullet"/>
+      <w:lvlText w:val=""/>
+      <w:lvlJc w:val="left"/>
+      <w:pPr>
+        <w:ind w:left="4320" w:hanging="360"/>
+      </w:pPr>
+      <w:rPr>
+        <w:rFonts w:ascii="Wingdings" w:hAnsi="Wingdings" w:hint="default"/>
+      </w:rPr>
+    </w:lvl>
+    <w:lvl w:ilvl="6" w:tplc="04090001" w:tentative="1">
+      <w:start w:val="1"/>
+      <w:numFmt w:val="bullet"/>
+      <w:lvlText w:val=""/>
+      <w:lvlJc w:val="left"/>
+      <w:pPr>
+        <w:ind w:left="5040" w:hanging="360"/>
+      </w:pPr>
+      <w:rPr>
+        <w:rFonts w:ascii="Symbol" w:hAnsi="Symbol" w:hint="default"/>
+      </w:rPr>
+    </w:lvl>
+    <w:lvl w:ilvl="7" w:tplc="04090003" w:tentative="1">
+      <w:start w:val="1"/>
+      <w:numFmt w:val="bullet"/>
+      <w:lvlText w:val="o"/>
+      <w:lvlJc w:val="left"/>
+      <w:pPr>
+        <w:ind w:left="5760" w:hanging="360"/>
+      </w:pPr>
+      <w:rPr>
+        <w:rFonts w:ascii="Courier New" w:hAnsi="Courier New" w:cs="Courier New" w:hint="default"/>
+      </w:rPr>
+    </w:lvl>
+    <w:lvl w:ilvl="8" w:tplc="04090005" w:tentative="1">
+      <w:start w:val="1"/>
+      <w:numFmt w:val="bullet"/>
+      <w:lvlText w:val=""/>
+      <w:lvlJc w:val="left"/>
+      <w:pPr>
+        <w:ind w:left="6480" w:hanging="360"/>
+      </w:pPr>
+      <w:rPr>
+        <w:rFonts w:ascii="Wingdings" w:hAnsi="Wingdings" w:hint="default"/>
+      </w:rPr>
+    </w:lvl>
+  </w:abstractNum>
+  <w:abstractNum w:abstractNumId="16" w15:restartNumberingAfterBreak="0">
     <w:nsid w:val="3A877D64"/>
     <w:multiLevelType w:val="singleLevel"/>
     <w:tmpl w:val="BEBA665C"/>
@@ -4633,7 +3721,7 @@
       </w:rPr>
     </w:lvl>
   </w:abstractNum>
-  <w:abstractNum w:abstractNumId="16" w15:restartNumberingAfterBreak="0">
+  <w:abstractNum w:abstractNumId="17" w15:restartNumberingAfterBreak="0">
     <w:nsid w:val="3DB04801"/>
     <w:multiLevelType w:val="multilevel"/>
     <w:tmpl w:val="3DB04801"/>
@@ -4754,13 +3842,13 @@
       </w:rPr>
     </w:lvl>
   </w:abstractNum>
-  <w:abstractNum w:abstractNumId="17" w15:restartNumberingAfterBreak="0">
+  <w:abstractNum w:abstractNumId="18" w15:restartNumberingAfterBreak="0">
     <w:nsid w:val="41807D55"/>
     <w:multiLevelType w:val="multilevel"/>
     <w:tmpl w:val="D12C42A8"/>
     <w:numStyleLink w:val="Style1"/>
   </w:abstractNum>
-  <w:abstractNum w:abstractNumId="18" w15:restartNumberingAfterBreak="0">
+  <w:abstractNum w:abstractNumId="19" w15:restartNumberingAfterBreak="0">
     <w:nsid w:val="4C8C68BF"/>
     <w:multiLevelType w:val="multilevel"/>
     <w:tmpl w:val="5216ACEE"/>
@@ -4864,7 +3952,7 @@
       </w:pPr>
     </w:lvl>
   </w:abstractNum>
-  <w:abstractNum w:abstractNumId="19" w15:restartNumberingAfterBreak="0">
+  <w:abstractNum w:abstractNumId="20" w15:restartNumberingAfterBreak="0">
     <w:nsid w:val="518E05DF"/>
     <w:multiLevelType w:val="hybridMultilevel"/>
     <w:tmpl w:val="B3680E58"/>
@@ -4977,13 +4065,13 @@
       </w:rPr>
     </w:lvl>
   </w:abstractNum>
-  <w:abstractNum w:abstractNumId="20" w15:restartNumberingAfterBreak="0">
+  <w:abstractNum w:abstractNumId="21" w15:restartNumberingAfterBreak="0">
     <w:nsid w:val="54EA5B41"/>
     <w:multiLevelType w:val="multilevel"/>
     <w:tmpl w:val="D12C42A8"/>
     <w:numStyleLink w:val="Style1"/>
   </w:abstractNum>
-  <w:abstractNum w:abstractNumId="21" w15:restartNumberingAfterBreak="0">
+  <w:abstractNum w:abstractNumId="22" w15:restartNumberingAfterBreak="0">
     <w:nsid w:val="750B6694"/>
     <w:multiLevelType w:val="multilevel"/>
     <w:tmpl w:val="70E8F76C"/>
@@ -5132,7 +4220,7 @@
       </w:rPr>
     </w:lvl>
   </w:abstractNum>
-  <w:abstractNum w:abstractNumId="22" w15:restartNumberingAfterBreak="0">
+  <w:abstractNum w:abstractNumId="23" w15:restartNumberingAfterBreak="0">
     <w:nsid w:val="751B6634"/>
     <w:multiLevelType w:val="multilevel"/>
     <w:tmpl w:val="4C6C5674"/>
@@ -5273,7 +4361,7 @@
     </w:lvl>
   </w:abstractNum>
   <w:num w:numId="1" w16cid:durableId="109059466">
-    <w:abstractNumId w:val="21"/>
+    <w:abstractNumId w:val="22"/>
   </w:num>
   <w:num w:numId="2" w16cid:durableId="442696162">
     <w:abstractNumId w:val="0"/>
@@ -5291,31 +4379,31 @@
     <w:abstractNumId w:val="11"/>
   </w:num>
   <w:num w:numId="7" w16cid:durableId="514270474">
-    <w:abstractNumId w:val="21"/>
+    <w:abstractNumId w:val="22"/>
   </w:num>
   <w:num w:numId="8" w16cid:durableId="1098989301">
-    <w:abstractNumId w:val="19"/>
+    <w:abstractNumId w:val="20"/>
   </w:num>
   <w:num w:numId="9" w16cid:durableId="1218708814">
-    <w:abstractNumId w:val="21"/>
+    <w:abstractNumId w:val="22"/>
   </w:num>
   <w:num w:numId="10" w16cid:durableId="1937984637">
-    <w:abstractNumId w:val="21"/>
+    <w:abstractNumId w:val="22"/>
   </w:num>
   <w:num w:numId="11" w16cid:durableId="7760395">
-    <w:abstractNumId w:val="21"/>
+    <w:abstractNumId w:val="22"/>
   </w:num>
   <w:num w:numId="12" w16cid:durableId="980354579">
-    <w:abstractNumId w:val="15"/>
+    <w:abstractNumId w:val="16"/>
   </w:num>
   <w:num w:numId="13" w16cid:durableId="1727952931">
-    <w:abstractNumId w:val="21"/>
+    <w:abstractNumId w:val="22"/>
   </w:num>
   <w:num w:numId="14" w16cid:durableId="1301886113">
-    <w:abstractNumId w:val="21"/>
+    <w:abstractNumId w:val="22"/>
   </w:num>
   <w:num w:numId="15" w16cid:durableId="175773451">
-    <w:abstractNumId w:val="16"/>
+    <w:abstractNumId w:val="17"/>
   </w:num>
   <w:num w:numId="16" w16cid:durableId="464205169">
     <w:abstractNumId w:val="3"/>
@@ -5324,16 +4412,16 @@
     <w:abstractNumId w:val="7"/>
   </w:num>
   <w:num w:numId="18" w16cid:durableId="1343439344">
-    <w:abstractNumId w:val="21"/>
+    <w:abstractNumId w:val="22"/>
   </w:num>
   <w:num w:numId="19" w16cid:durableId="1211189420">
-    <w:abstractNumId w:val="21"/>
+    <w:abstractNumId w:val="22"/>
   </w:num>
   <w:num w:numId="20" w16cid:durableId="119157352">
-    <w:abstractNumId w:val="21"/>
+    <w:abstractNumId w:val="22"/>
   </w:num>
   <w:num w:numId="21" w16cid:durableId="1896893194">
-    <w:abstractNumId w:val="21"/>
+    <w:abstractNumId w:val="22"/>
     <w:lvlOverride w:ilvl="0">
       <w:startOverride w:val="1"/>
     </w:lvlOverride>
@@ -5363,7 +4451,7 @@
     </w:lvlOverride>
   </w:num>
   <w:num w:numId="22" w16cid:durableId="97608568">
-    <w:abstractNumId w:val="18"/>
+    <w:abstractNumId w:val="19"/>
   </w:num>
   <w:num w:numId="23" w16cid:durableId="1101486262">
     <w:abstractNumId w:val="2"/>
@@ -5372,7 +4460,7 @@
     <w:abstractNumId w:val="4"/>
   </w:num>
   <w:num w:numId="25" w16cid:durableId="1870871891">
-    <w:abstractNumId w:val="20"/>
+    <w:abstractNumId w:val="21"/>
   </w:num>
   <w:num w:numId="26" w16cid:durableId="980309134">
     <w:abstractNumId w:val="1"/>
@@ -5393,10 +4481,13 @@
     <w:abstractNumId w:val="9"/>
   </w:num>
   <w:num w:numId="32" w16cid:durableId="1797680710">
-    <w:abstractNumId w:val="17"/>
+    <w:abstractNumId w:val="18"/>
   </w:num>
   <w:num w:numId="33" w16cid:durableId="1976520211">
-    <w:abstractNumId w:val="22"/>
+    <w:abstractNumId w:val="23"/>
+  </w:num>
+  <w:num w:numId="34" w16cid:durableId="1845853954">
+    <w:abstractNumId w:val="15"/>
   </w:num>
   <w:numIdMacAtCleanup w:val="5"/>
 </w:numbering>
@@ -5415,7 +4506,7 @@
   </w:docDefaults>
   <w:latentStyles w:defLockedState="0" w:defUIPriority="0" w:defSemiHidden="0" w:defUnhideWhenUsed="0" w:defQFormat="0" w:count="376">
     <w:lsdException w:name="Normal" w:qFormat="1"/>
-    <w:lsdException w:name="heading 1" w:qFormat="1"/>
+    <w:lsdException w:name="heading 1" w:uiPriority="9" w:qFormat="1"/>
     <w:lsdException w:name="heading 2" w:qFormat="1"/>
     <w:lsdException w:name="heading 3" w:qFormat="1"/>
     <w:lsdException w:name="heading 4" w:qFormat="1"/>
@@ -5796,6 +4887,7 @@
       <w:jc w:val="both"/>
     </w:pPr>
     <w:rPr>
+      <w:noProof/>
       <w:sz w:val="24"/>
       <w:lang w:val="en-US" w:eastAsia="cs-CZ"/>
     </w:rPr>
@@ -5804,6 +4896,8 @@
     <w:name w:val="heading 1"/>
     <w:basedOn w:val="Normal"/>
     <w:next w:val="Normal"/>
+    <w:link w:val="Heading1Char"/>
+    <w:uiPriority w:val="9"/>
     <w:qFormat/>
     <w:rsid w:val="006C5AA4"/>
     <w:pPr>
@@ -6756,6 +5850,40 @@
         <w:numId w:val="24"/>
       </w:numPr>
     </w:pPr>
+  </w:style>
+  <w:style w:type="paragraph" w:styleId="ListParagraph">
+    <w:name w:val="List Paragraph"/>
+    <w:basedOn w:val="Normal"/>
+    <w:uiPriority w:val="34"/>
+    <w:qFormat/>
+    <w:rsid w:val="009679FE"/>
+    <w:pPr>
+      <w:ind w:left="720"/>
+      <w:contextualSpacing/>
+    </w:pPr>
+  </w:style>
+  <w:style w:type="character" w:customStyle="1" w:styleId="Heading1Char">
+    <w:name w:val="Heading 1 Char"/>
+    <w:basedOn w:val="DefaultParagraphFont"/>
+    <w:link w:val="Heading1"/>
+    <w:uiPriority w:val="9"/>
+    <w:rsid w:val="00926ED6"/>
+    <w:rPr>
+      <w:b/>
+      <w:bCs/>
+      <w:kern w:val="28"/>
+      <w:sz w:val="28"/>
+      <w:szCs w:val="30"/>
+      <w:lang w:val="en-US" w:eastAsia="cs-CZ"/>
+    </w:rPr>
+  </w:style>
+  <w:style w:type="paragraph" w:styleId="Bibliography">
+    <w:name w:val="Bibliography"/>
+    <w:basedOn w:val="Normal"/>
+    <w:next w:val="Normal"/>
+    <w:uiPriority w:val="37"/>
+    <w:unhideWhenUsed/>
+    <w:rsid w:val="00926ED6"/>
   </w:style>
 </w:styles>
 </file>
@@ -7056,11 +6184,359 @@
 </file>
 
 <file path=customXml/item1.xml><?xml version="1.0" encoding="utf-8"?>
-<b:Sources xmlns:b="http://schemas.openxmlformats.org/officeDocument/2006/bibliography" xmlns="http://schemas.openxmlformats.org/officeDocument/2006/bibliography" SelectedStyle="\APA.XSL" StyleName="APA"/>
+<b:Sources xmlns:b="http://schemas.openxmlformats.org/officeDocument/2006/bibliography" xmlns="http://schemas.openxmlformats.org/officeDocument/2006/bibliography" SelectedStyle="\APASixthEditionOfficeOnline.xsl" StyleName="APA" Version="6">
+  <b:Source>
+    <b:Tag>Aki24</b:Tag>
+    <b:SourceType>Misc</b:SourceType>
+    <b:Guid>{908CBDC6-E0FB-4365-B8AC-E77055A71D5D}</b:Guid>
+    <b:Author>
+      <b:Author>
+        <b:NameList>
+          <b:Person>
+            <b:Last>Akinboyewa</b:Last>
+            <b:First>T</b:First>
+          </b:Person>
+          <b:Person>
+            <b:Last>Ning</b:Last>
+            <b:First>H</b:First>
+          </b:Person>
+          <b:Person>
+            <b:Last>Lessani</b:Last>
+            <b:First>M,</b:First>
+            <b:Middle>N</b:Middle>
+          </b:Person>
+          <b:Person>
+            <b:Last>Li</b:Last>
+            <b:First>Z</b:First>
+          </b:Person>
+        </b:NameList>
+      </b:Author>
+    </b:Author>
+    <b:Title>Automated Floodwater Depth Estimation Using Large Multimodal Model for Rapid Flood Mapping</b:Title>
+    <b:Year>2024</b:Year>
+    <b:LCID>en-US</b:LCID>
+    <b:RefOrder>4</b:RefOrder>
+  </b:Source>
+  <b:Source>
+    <b:Tag>Fen20</b:Tag>
+    <b:SourceType>JournalArticle</b:SourceType>
+    <b:Guid>{034D5FF7-7DDC-4E98-AA6F-EF8BA8BEC4C0}</b:Guid>
+    <b:Author>
+      <b:Author>
+        <b:NameList>
+          <b:Person>
+            <b:Last>Feng</b:Last>
+            <b:First>Y</b:First>
+          </b:Person>
+          <b:Person>
+            <b:Last>Brenner</b:Last>
+            <b:First>C</b:First>
+          </b:Person>
+          <b:Person>
+            <b:Last>Sester</b:Last>
+            <b:First>M</b:First>
+          </b:Person>
+        </b:NameList>
+      </b:Author>
+    </b:Author>
+    <b:Title>Flood severity mapping from Volunteered Geographic Information by interpreting water level from images containing people: A case study of Hurricane Harvey</b:Title>
+    <b:Year>2020</b:Year>
+    <b:JournalName>ISPRS Journal of Photogrammetry and Remote Sensing</b:JournalName>
+    <b:LCID>en-US</b:LCID>
+    <b:RefOrder>5</b:RefOrder>
+  </b:Source>
+  <b:Source>
+    <b:Tag>Fer23</b:Tag>
+    <b:SourceType>Misc</b:SourceType>
+    <b:Guid>{F4DE3264-DF77-4414-872A-D30D232A9A31}</b:Guid>
+    <b:Author>
+      <b:Author>
+        <b:NameList>
+          <b:Person>
+            <b:Last>Fernandez</b:Last>
+            <b:First>A</b:First>
+          </b:Person>
+          <b:Person>
+            <b:Last>Dube</b:Last>
+            <b:First>S</b:First>
+          </b:Person>
+        </b:NameList>
+      </b:Author>
+    </b:Author>
+    <b:Title>Core Building Blocks: Next Gen Geo Spatial GPT Application</b:Title>
+    <b:Year>2023</b:Year>
+    <b:LCID>en-US</b:LCID>
+    <b:RefOrder>2</b:RefOrder>
+  </b:Source>
+  <b:Source>
+    <b:Tag>Han23</b:Tag>
+    <b:SourceType>Misc</b:SourceType>
+    <b:Guid>{C8D69F92-F69E-467F-9399-07A5FD732A9E}</b:Guid>
+    <b:Author>
+      <b:Author>
+        <b:NameList>
+          <b:Person>
+            <b:Last>Han</b:Last>
+            <b:First>B,</b:First>
+            <b:Middle>A</b:Middle>
+          </b:Person>
+          <b:Person>
+            <b:Last>Varshney</b:Last>
+            <b:First>K,</b:First>
+            <b:Middle>R</b:Middle>
+          </b:Person>
+          <b:Person>
+            <b:Last>LaDeau</b:Last>
+            <b:First>S</b:First>
+          </b:Person>
+          <b:Person>
+            <b:Last>Subramaniam</b:Last>
+            <b:First>A</b:First>
+          </b:Person>
+          <b:Person>
+            <b:Last>Weathers</b:Last>
+            <b:First>K,</b:First>
+            <b:Middle>C</b:Middle>
+          </b:Person>
+          <b:Person>
+            <b:Last>Zwart</b:Last>
+            <b:First>J</b:First>
+          </b:Person>
+        </b:NameList>
+      </b:Author>
+    </b:Author>
+    <b:Title>A synergistic future for AI and ecology</b:Title>
+    <b:Year>2023</b:Year>
+    <b:LCID>en-US</b:LCID>
+    <b:RefOrder>8</b:RefOrder>
+  </b:Source>
+  <b:Source>
+    <b:Tag>Jan23</b:Tag>
+    <b:SourceType>Misc</b:SourceType>
+    <b:Guid>{7C4292B3-4C76-4673-AACD-3589E417F50E}</b:Guid>
+    <b:Author>
+      <b:Author>
+        <b:NameList>
+          <b:Person>
+            <b:Last>Jang</b:Last>
+            <b:First>K,</b:First>
+            <b:Middle>M</b:Middle>
+          </b:Person>
+          <b:Person>
+            <b:Last>Chen</b:Last>
+            <b:First>J</b:First>
+          </b:Person>
+          <b:Person>
+            <b:Last>Kang</b:Last>
+            <b:First>Y</b:First>
+          </b:Person>
+          <b:Person>
+            <b:Last>Kim</b:Last>
+            <b:First>J</b:First>
+          </b:Person>
+          <b:Person>
+            <b:Last>Lee</b:Last>
+            <b:First>J</b:First>
+          </b:Person>
+          <b:Person>
+            <b:Last>Duarte</b:Last>
+            <b:First>F</b:First>
+          </b:Person>
+        </b:NameList>
+      </b:Author>
+    </b:Author>
+    <b:Title>Understanding Place Identity with Generative AI</b:Title>
+    <b:Year>2023</b:Year>
+    <b:LCID>en-US</b:LCID>
+    <b:RefOrder>7</b:RefOrder>
+  </b:Source>
+  <b:Source>
+    <b:Tag>Mai23</b:Tag>
+    <b:SourceType>Misc</b:SourceType>
+    <b:Guid>{FB62759B-7082-43C7-893B-8BABF9E467F5}</b:Guid>
+    <b:Author>
+      <b:Author>
+        <b:NameList>
+          <b:Person>
+            <b:Last>Mai</b:Last>
+            <b:First>G</b:First>
+          </b:Person>
+          <b:Person>
+            <b:Last>Huang</b:Last>
+            <b:First>W</b:First>
+          </b:Person>
+          <b:Person>
+            <b:Last>Sun</b:Last>
+            <b:First>J</b:First>
+          </b:Person>
+          <b:Person>
+            <b:Last>Song</b:Last>
+            <b:First>S</b:First>
+          </b:Person>
+          <b:Person>
+            <b:Last>Mishra</b:Last>
+            <b:First>D</b:First>
+          </b:Person>
+          <b:Person>
+            <b:Last>Liu</b:Last>
+            <b:First>N</b:First>
+          </b:Person>
+          <b:Person>
+            <b:Last>et al</b:Last>
+          </b:Person>
+        </b:NameList>
+      </b:Author>
+    </b:Author>
+    <b:Title>On the Opportunities and Challenges of Foundation Models for Geospatial Artificial Intelligence</b:Title>
+    <b:Year>2023</b:Year>
+    <b:LCID>en-US</b:LCID>
+    <b:RefOrder>9</b:RefOrder>
+  </b:Source>
+  <b:Source>
+    <b:Tag>HuY23</b:Tag>
+    <b:SourceType>JournalArticle</b:SourceType>
+    <b:Guid>{A58932C6-7CCA-4A16-9D60-8DBC1B209916}</b:Guid>
+    <b:Author>
+      <b:Author>
+        <b:NameList>
+          <b:Person>
+            <b:Last>Hu</b:Last>
+            <b:First>Y</b:First>
+          </b:Person>
+          <b:Person>
+            <b:Last>Mai</b:Last>
+            <b:First>G</b:First>
+          </b:Person>
+          <b:Person>
+            <b:Last>Cundy</b:Last>
+            <b:First>C</b:First>
+          </b:Person>
+          <b:Person>
+            <b:Last>Choi</b:Last>
+            <b:First>K</b:First>
+          </b:Person>
+          <b:Person>
+            <b:Last>Lao</b:Last>
+            <b:First>N</b:First>
+          </b:Person>
+          <b:Person>
+            <b:Last>Liu</b:Last>
+            <b:First>W</b:First>
+          </b:Person>
+          <b:Person>
+            <b:Last>et al</b:Last>
+          </b:Person>
+        </b:NameList>
+      </b:Author>
+    </b:Author>
+    <b:Title>Geo-knowledge-guided GPT models improve the extraction of location descriptions from disaster-related social media messages</b:Title>
+    <b:Year>2023</b:Year>
+    <b:JournalName>International Journal of Geographical Information Science</b:JournalName>
+    <b:LCID>en-US</b:LCID>
+    <b:RefOrder>6</b:RefOrder>
+  </b:Source>
+  <b:Source>
+    <b:Tag>Man24</b:Tag>
+    <b:SourceType>Misc</b:SourceType>
+    <b:Guid>{3347DA8D-9908-4EA9-95BC-D03798F61988}</b:Guid>
+    <b:Author>
+      <b:Author>
+        <b:NameList>
+          <b:Person>
+            <b:Last>Manvi</b:Last>
+            <b:First>R</b:First>
+          </b:Person>
+          <b:Person>
+            <b:Last>Khanna</b:Last>
+            <b:First>S</b:First>
+          </b:Person>
+          <b:Person>
+            <b:Last>Mai</b:Last>
+            <b:First>G</b:First>
+          </b:Person>
+          <b:Person>
+            <b:Last>Burke</b:Last>
+            <b:First>M</b:First>
+          </b:Person>
+          <b:Person>
+            <b:Last>Lobell</b:Last>
+            <b:First>D</b:First>
+          </b:Person>
+          <b:Person>
+            <b:Last>Ermon</b:Last>
+            <b:First>S</b:First>
+          </b:Person>
+        </b:NameList>
+      </b:Author>
+    </b:Author>
+    <b:Title>GeoLLM: Extracting Geospatial Knowledge from Large Language Models</b:Title>
+    <b:Year>2024</b:Year>
+    <b:LCID>en-US</b:LCID>
+    <b:RefOrder>3</b:RefOrder>
+  </b:Source>
+  <b:Source>
+    <b:Tag>Zha23</b:Tag>
+    <b:SourceType>Misc</b:SourceType>
+    <b:Guid>{A71C0FD5-6A6D-452D-BE63-340A169DDF0F}</b:Guid>
+    <b:Title>GeoGPT: Understanding and Processing Geospatial Tasks through An Autonomous GPT</b:Title>
+    <b:Year>2023</b:Year>
+    <b:Author>
+      <b:Author>
+        <b:NameList>
+          <b:Person>
+            <b:Last>Zhang</b:Last>
+            <b:First>Y</b:First>
+          </b:Person>
+          <b:Person>
+            <b:Last>Wei</b:Last>
+            <b:First>C</b:First>
+          </b:Person>
+          <b:Person>
+            <b:Last>Wu</b:Last>
+            <b:First>S</b:First>
+          </b:Person>
+          <b:Person>
+            <b:Last>He</b:Last>
+            <b:First>Z</b:First>
+          </b:Person>
+          <b:Person>
+            <b:Last>Yu</b:Last>
+            <b:First>W</b:First>
+          </b:Person>
+        </b:NameList>
+      </b:Author>
+    </b:Author>
+    <b:LCID>en-US</b:LCID>
+    <b:RefOrder>1</b:RefOrder>
+  </b:Source>
+  <b:Source>
+    <b:Tag>LiZ23</b:Tag>
+    <b:SourceType>JournalArticle</b:SourceType>
+    <b:Guid>{B30F9BA2-807A-4C49-B671-E95146E198B8}</b:Guid>
+    <b:Author>
+      <b:Author>
+        <b:NameList>
+          <b:Person>
+            <b:Last>Li</b:Last>
+            <b:First>Z</b:First>
+          </b:Person>
+          <b:Person>
+            <b:Last>Ning</b:Last>
+            <b:First>H</b:First>
+          </b:Person>
+        </b:NameList>
+      </b:Author>
+    </b:Author>
+    <b:Title>Autonomous GIS: the next-generation AI-powered GIS</b:Title>
+    <b:Year>2023</b:Year>
+    <b:JournalName> International Journal of Digital Earth</b:JournalName>
+    <b:RefOrder>10</b:RefOrder>
+  </b:Source>
+</b:Sources>
 </file>
 
 <file path=customXml/itemProps1.xml><?xml version="1.0" encoding="utf-8"?>
-<ds:datastoreItem xmlns:ds="http://schemas.openxmlformats.org/officeDocument/2006/customXml" ds:itemID="{D3EDABB2-AF07-4D54-BC40-86BBE32F8B8C}">
+<ds:datastoreItem xmlns:ds="http://schemas.openxmlformats.org/officeDocument/2006/customXml" ds:itemID="{032A778B-FEA2-4517-839F-F3F832AB4BA6}">
   <ds:schemaRefs>
     <ds:schemaRef ds:uri="http://schemas.openxmlformats.org/officeDocument/2006/bibliography"/>
   </ds:schemaRefs>

</xml_diff>